<commit_message>
Add the 200 real recordings and the results they give.
</commit_message>
<xml_diff>
--- a/report/Formative_2_Hidden_Markov_Models.docx
+++ b/report/Formative_2_Hidden_Markov_Models.docx
@@ -29,7 +29,7 @@
           <w:sz w:val="20"/>
           <w:szCs w:val="20"/>
         </w:rPr>
-        <w:t xml:space="preserve">Shima Serein  ·  African Leadership University  ·  25 October 2026</w:t>
+        <w:t xml:space="preserve">Shima Serein  ·  African Leadership University  ·  27 October 2026</w:t>
       </w:r>
     </w:p>
     <w:p>
@@ -63,7 +63,7 @@
           <w:sz w:val="22"/>
           <w:szCs w:val="22"/>
         </w:rPr>
-        <w:t xml:space="preserve">A phone at the waist, or left on a desk, streams acceleration and rotation. The question a campus break coach has to answer from that stream is which of four states the person is in: still, standing, walking, or jumping. Still, with the phone on the desk, is the sedentary time the coach should count. Standing in a corridor is not a walk across campus. Jumping belongs to sport. The state is hidden. Both standing and a phone lying on a table sit near one gravity, so a threshold on the raw magnitude cannot separate them. This project treats the four activities as the hidden states of a Gaussian hidden Markov model and the windowed sensor features as the observations.</w:t>
+        <w:t xml:space="preserve">A phone at the waist, or left on a desk, streams acceleration and rotation. The question a campus break coach has to answer from that stream is which of four states the person is in: still, standing, walking, or jumping. Still, with the phone on the desk, is the sedentary time the coach should count. Standing in a corridor is not a walk across campus, and jumping belongs to sport. The state itself is hidden: the phone only sees noisy motion. A phone held flat while standing and a phone lying flat on a table both read about one gravity, so a threshold on the raw magnitude cannot tell them apart. This project treats the four activities as the hidden states of a Gaussian hidden Markov model and windowed sensor features as its observations.</w:t>
       </w:r>
     </w:p>
     <w:p>
@@ -97,7 +97,971 @@
           <w:sz w:val="22"/>
           <w:szCs w:val="22"/>
         </w:rPr>
-        <w:t xml:space="preserve">The CSV files under data/ are simulated streams, generated with seed 7. They are not Sensor Logger recordings of a person, and this repository does not contain the four face-visible videos the brief requires. The files exist so the model, the metrics, and the figures can be rebuilt without a phone. Replacing one of them is a drop-in change. The loader expects timestamp, acc_x, acc_y, acc_z, gyro_x, gyro_y, gyro_z, and activity.</w:t>
+        <w:t xml:space="preserve">All 200 recordings were made on 27 October 2026, in one session of about an hour, with Sensor Logger 1.68 on one iPhone 16 Pro. The accelerometer and the gyroscope were both sampled every 10 ms (100 Hz). Each activity was recorded as a block of 50 files: standing with the phone held steady at waist level, screen up; walking at a steady pace, holding the phone the same way; continuous jumps; and still, with the phone lying on a flat surface. Every file is between 5.6 and 9.9 seconds long, and every activity has between 393 and 439 seconds in total, well above the 90-second minimum (Table 1).</w:t>
+      </w:r>
+    </w:p>
+    <w:tbl>
+      <w:tblPr>
+        <w:tblW w:type="dxa" w:w="10080"/>
+        <w:tblBorders>
+          <w:top w:val="single" w:color="auto" w:sz="4"/>
+          <w:left w:val="single" w:color="auto" w:sz="4"/>
+          <w:bottom w:val="single" w:color="auto" w:sz="4"/>
+          <w:right w:val="single" w:color="auto" w:sz="4"/>
+          <w:insideH w:val="single" w:color="auto" w:sz="4"/>
+          <w:insideV w:val="single" w:color="auto" w:sz="4"/>
+        </w:tblBorders>
+      </w:tblPr>
+      <w:tblGrid>
+        <w:gridCol w:w="2080"/>
+        <w:gridCol w:w="1400"/>
+        <w:gridCol w:w="1900"/>
+        <w:gridCol w:w="2600"/>
+        <w:gridCol w:w="2100"/>
+      </w:tblGrid>
+      <w:tr>
+        <w:trPr>
+          <w:cantSplit/>
+          <w:tblHeader/>
+        </w:trPr>
+        <w:tc>
+          <w:tcPr>
+            <w:tcW w:type="dxa" w:w="2080"/>
+            <w:tcBorders>
+              <w:top w:val="single" w:color="D0D7E2" w:sz="4"/>
+              <w:left w:val="single" w:color="D0D7E2" w:sz="4"/>
+              <w:bottom w:val="single" w:color="D0D7E2" w:sz="4"/>
+              <w:right w:val="single" w:color="D0D7E2" w:sz="4"/>
+            </w:tcBorders>
+            <w:shd w:fill="E7EEF7" w:val="clear"/>
+            <w:tcMar>
+              <w:top w:type="dxa" w:w="36"/>
+              <w:left w:type="dxa" w:w="70"/>
+              <w:bottom w:type="dxa" w:w="36"/>
+              <w:right w:type="dxa" w:w="70"/>
+            </w:tcMar>
+            <w:vAlign w:val="center"/>
+          </w:tcPr>
+          <w:p>
+            <w:pPr>
+              <w:spacing w:after="0" w:before="0"/>
+              <w:jc w:val="left"/>
+            </w:pPr>
+            <w:r>
+              <w:rPr>
+                <w:rFonts w:ascii="Arial" w:cs="Arial" w:eastAsia="Arial" w:hAnsi="Arial"/>
+                <w:b/>
+                <w:bCs/>
+                <w:color w:val="1F4E79"/>
+                <w:sz w:val="18"/>
+                <w:szCs w:val="18"/>
+              </w:rPr>
+              <w:t xml:space="preserve">Activity</w:t>
+            </w:r>
+          </w:p>
+        </w:tc>
+        <w:tc>
+          <w:tcPr>
+            <w:tcW w:type="dxa" w:w="1400"/>
+            <w:tcBorders>
+              <w:top w:val="single" w:color="D0D7E2" w:sz="4"/>
+              <w:left w:val="single" w:color="D0D7E2" w:sz="4"/>
+              <w:bottom w:val="single" w:color="D0D7E2" w:sz="4"/>
+              <w:right w:val="single" w:color="D0D7E2" w:sz="4"/>
+            </w:tcBorders>
+            <w:shd w:fill="E7EEF7" w:val="clear"/>
+            <w:tcMar>
+              <w:top w:type="dxa" w:w="36"/>
+              <w:left w:type="dxa" w:w="70"/>
+              <w:bottom w:type="dxa" w:w="36"/>
+              <w:right w:type="dxa" w:w="70"/>
+            </w:tcMar>
+            <w:vAlign w:val="center"/>
+          </w:tcPr>
+          <w:p>
+            <w:pPr>
+              <w:spacing w:after="0" w:before="0"/>
+              <w:jc w:val="center"/>
+            </w:pPr>
+            <w:r>
+              <w:rPr>
+                <w:rFonts w:ascii="Arial" w:cs="Arial" w:eastAsia="Arial" w:hAnsi="Arial"/>
+                <w:b/>
+                <w:bCs/>
+                <w:color w:val="1F4E79"/>
+                <w:sz w:val="18"/>
+                <w:szCs w:val="18"/>
+              </w:rPr>
+              <w:t xml:space="preserve">Files</w:t>
+            </w:r>
+          </w:p>
+        </w:tc>
+        <w:tc>
+          <w:tcPr>
+            <w:tcW w:type="dxa" w:w="1900"/>
+            <w:tcBorders>
+              <w:top w:val="single" w:color="D0D7E2" w:sz="4"/>
+              <w:left w:val="single" w:color="D0D7E2" w:sz="4"/>
+              <w:bottom w:val="single" w:color="D0D7E2" w:sz="4"/>
+              <w:right w:val="single" w:color="D0D7E2" w:sz="4"/>
+            </w:tcBorders>
+            <w:shd w:fill="E7EEF7" w:val="clear"/>
+            <w:tcMar>
+              <w:top w:type="dxa" w:w="36"/>
+              <w:left w:type="dxa" w:w="70"/>
+              <w:bottom w:type="dxa" w:w="36"/>
+              <w:right w:type="dxa" w:w="70"/>
+            </w:tcMar>
+            <w:vAlign w:val="center"/>
+          </w:tcPr>
+          <w:p>
+            <w:pPr>
+              <w:spacing w:after="0" w:before="0"/>
+              <w:jc w:val="center"/>
+            </w:pPr>
+            <w:r>
+              <w:rPr>
+                <w:rFonts w:ascii="Arial" w:cs="Arial" w:eastAsia="Arial" w:hAnsi="Arial"/>
+                <w:b/>
+                <w:bCs/>
+                <w:color w:val="1F4E79"/>
+                <w:sz w:val="18"/>
+                <w:szCs w:val="18"/>
+              </w:rPr>
+              <w:t xml:space="preserve">Total (s)</w:t>
+            </w:r>
+          </w:p>
+        </w:tc>
+        <w:tc>
+          <w:tcPr>
+            <w:tcW w:type="dxa" w:w="2600"/>
+            <w:tcBorders>
+              <w:top w:val="single" w:color="D0D7E2" w:sz="4"/>
+              <w:left w:val="single" w:color="D0D7E2" w:sz="4"/>
+              <w:bottom w:val="single" w:color="D0D7E2" w:sz="4"/>
+              <w:right w:val="single" w:color="D0D7E2" w:sz="4"/>
+            </w:tcBorders>
+            <w:shd w:fill="E7EEF7" w:val="clear"/>
+            <w:tcMar>
+              <w:top w:type="dxa" w:w="36"/>
+              <w:left w:type="dxa" w:w="70"/>
+              <w:bottom w:type="dxa" w:w="36"/>
+              <w:right w:type="dxa" w:w="70"/>
+            </w:tcMar>
+            <w:vAlign w:val="center"/>
+          </w:tcPr>
+          <w:p>
+            <w:pPr>
+              <w:spacing w:after="0" w:before="0"/>
+              <w:jc w:val="center"/>
+            </w:pPr>
+            <w:r>
+              <w:rPr>
+                <w:rFonts w:ascii="Arial" w:cs="Arial" w:eastAsia="Arial" w:hAnsi="Arial"/>
+                <w:b/>
+                <w:bCs/>
+                <w:color w:val="1F4E79"/>
+                <w:sz w:val="18"/>
+                <w:szCs w:val="18"/>
+              </w:rPr>
+              <w:t xml:space="preserve">Length of one file (s)</w:t>
+            </w:r>
+          </w:p>
+        </w:tc>
+        <w:tc>
+          <w:tcPr>
+            <w:tcW w:type="dxa" w:w="2100"/>
+            <w:tcBorders>
+              <w:top w:val="single" w:color="D0D7E2" w:sz="4"/>
+              <w:left w:val="single" w:color="D0D7E2" w:sz="4"/>
+              <w:bottom w:val="single" w:color="D0D7E2" w:sz="4"/>
+              <w:right w:val="single" w:color="D0D7E2" w:sz="4"/>
+            </w:tcBorders>
+            <w:shd w:fill="E7EEF7" w:val="clear"/>
+            <w:tcMar>
+              <w:top w:type="dxa" w:w="36"/>
+              <w:left w:type="dxa" w:w="70"/>
+              <w:bottom w:type="dxa" w:w="36"/>
+              <w:right w:type="dxa" w:w="70"/>
+            </w:tcMar>
+            <w:vAlign w:val="center"/>
+          </w:tcPr>
+          <w:p>
+            <w:pPr>
+              <w:spacing w:after="0" w:before="0"/>
+              <w:jc w:val="center"/>
+            </w:pPr>
+            <w:r>
+              <w:rPr>
+                <w:rFonts w:ascii="Arial" w:cs="Arial" w:eastAsia="Arial" w:hAnsi="Arial"/>
+                <w:b/>
+                <w:bCs/>
+                <w:color w:val="1F4E79"/>
+                <w:sz w:val="18"/>
+                <w:szCs w:val="18"/>
+              </w:rPr>
+              <w:t xml:space="preserve">Train / test files</w:t>
+            </w:r>
+          </w:p>
+        </w:tc>
+      </w:tr>
+      <w:tr>
+        <w:trPr>
+          <w:cantSplit/>
+        </w:trPr>
+        <w:tc>
+          <w:tcPr>
+            <w:tcW w:type="dxa" w:w="2080"/>
+            <w:tcBorders>
+              <w:top w:val="single" w:color="D0D7E2" w:sz="4"/>
+              <w:left w:val="single" w:color="D0D7E2" w:sz="4"/>
+              <w:bottom w:val="single" w:color="D0D7E2" w:sz="4"/>
+              <w:right w:val="single" w:color="D0D7E2" w:sz="4"/>
+            </w:tcBorders>
+            <w:shd w:fill="FFFFFF" w:val="clear"/>
+            <w:tcMar>
+              <w:top w:type="dxa" w:w="36"/>
+              <w:left w:type="dxa" w:w="70"/>
+              <w:bottom w:type="dxa" w:w="36"/>
+              <w:right w:type="dxa" w:w="70"/>
+            </w:tcMar>
+            <w:vAlign w:val="center"/>
+          </w:tcPr>
+          <w:p>
+            <w:pPr>
+              <w:spacing w:after="0" w:before="0"/>
+              <w:jc w:val="left"/>
+            </w:pPr>
+            <w:r>
+              <w:rPr>
+                <w:rFonts w:ascii="Arial" w:cs="Arial" w:eastAsia="Arial" w:hAnsi="Arial"/>
+                <w:b w:val="false"/>
+                <w:bCs w:val="false"/>
+                <w:color w:val="222222"/>
+                <w:sz w:val="18"/>
+                <w:szCs w:val="18"/>
+              </w:rPr>
+              <w:t xml:space="preserve">Standing</w:t>
+            </w:r>
+          </w:p>
+        </w:tc>
+        <w:tc>
+          <w:tcPr>
+            <w:tcW w:type="dxa" w:w="1400"/>
+            <w:tcBorders>
+              <w:top w:val="single" w:color="D0D7E2" w:sz="4"/>
+              <w:left w:val="single" w:color="D0D7E2" w:sz="4"/>
+              <w:bottom w:val="single" w:color="D0D7E2" w:sz="4"/>
+              <w:right w:val="single" w:color="D0D7E2" w:sz="4"/>
+            </w:tcBorders>
+            <w:shd w:fill="FFFFFF" w:val="clear"/>
+            <w:tcMar>
+              <w:top w:type="dxa" w:w="36"/>
+              <w:left w:type="dxa" w:w="70"/>
+              <w:bottom w:type="dxa" w:w="36"/>
+              <w:right w:type="dxa" w:w="70"/>
+            </w:tcMar>
+            <w:vAlign w:val="center"/>
+          </w:tcPr>
+          <w:p>
+            <w:pPr>
+              <w:spacing w:after="0" w:before="0"/>
+              <w:jc w:val="center"/>
+            </w:pPr>
+            <w:r>
+              <w:rPr>
+                <w:rFonts w:ascii="Arial" w:cs="Arial" w:eastAsia="Arial" w:hAnsi="Arial"/>
+                <w:b w:val="false"/>
+                <w:bCs w:val="false"/>
+                <w:color w:val="222222"/>
+                <w:sz w:val="18"/>
+                <w:szCs w:val="18"/>
+              </w:rPr>
+              <w:t xml:space="preserve">50</w:t>
+            </w:r>
+          </w:p>
+        </w:tc>
+        <w:tc>
+          <w:tcPr>
+            <w:tcW w:type="dxa" w:w="1900"/>
+            <w:tcBorders>
+              <w:top w:val="single" w:color="D0D7E2" w:sz="4"/>
+              <w:left w:val="single" w:color="D0D7E2" w:sz="4"/>
+              <w:bottom w:val="single" w:color="D0D7E2" w:sz="4"/>
+              <w:right w:val="single" w:color="D0D7E2" w:sz="4"/>
+            </w:tcBorders>
+            <w:shd w:fill="FFFFFF" w:val="clear"/>
+            <w:tcMar>
+              <w:top w:type="dxa" w:w="36"/>
+              <w:left w:type="dxa" w:w="70"/>
+              <w:bottom w:type="dxa" w:w="36"/>
+              <w:right w:type="dxa" w:w="70"/>
+            </w:tcMar>
+            <w:vAlign w:val="center"/>
+          </w:tcPr>
+          <w:p>
+            <w:pPr>
+              <w:spacing w:after="0" w:before="0"/>
+              <w:jc w:val="center"/>
+            </w:pPr>
+            <w:r>
+              <w:rPr>
+                <w:rFonts w:ascii="Arial" w:cs="Arial" w:eastAsia="Arial" w:hAnsi="Arial"/>
+                <w:b w:val="false"/>
+                <w:bCs w:val="false"/>
+                <w:color w:val="222222"/>
+                <w:sz w:val="18"/>
+                <w:szCs w:val="18"/>
+              </w:rPr>
+              <w:t xml:space="preserve">438.5</w:t>
+            </w:r>
+          </w:p>
+        </w:tc>
+        <w:tc>
+          <w:tcPr>
+            <w:tcW w:type="dxa" w:w="2600"/>
+            <w:tcBorders>
+              <w:top w:val="single" w:color="D0D7E2" w:sz="4"/>
+              <w:left w:val="single" w:color="D0D7E2" w:sz="4"/>
+              <w:bottom w:val="single" w:color="D0D7E2" w:sz="4"/>
+              <w:right w:val="single" w:color="D0D7E2" w:sz="4"/>
+            </w:tcBorders>
+            <w:shd w:fill="FFFFFF" w:val="clear"/>
+            <w:tcMar>
+              <w:top w:type="dxa" w:w="36"/>
+              <w:left w:type="dxa" w:w="70"/>
+              <w:bottom w:type="dxa" w:w="36"/>
+              <w:right w:type="dxa" w:w="70"/>
+            </w:tcMar>
+            <w:vAlign w:val="center"/>
+          </w:tcPr>
+          <w:p>
+            <w:pPr>
+              <w:spacing w:after="0" w:before="0"/>
+              <w:jc w:val="center"/>
+            </w:pPr>
+            <w:r>
+              <w:rPr>
+                <w:rFonts w:ascii="Arial" w:cs="Arial" w:eastAsia="Arial" w:hAnsi="Arial"/>
+                <w:b w:val="false"/>
+                <w:bCs w:val="false"/>
+                <w:color w:val="222222"/>
+                <w:sz w:val="18"/>
+                <w:szCs w:val="18"/>
+              </w:rPr>
+              <w:t xml:space="preserve">5.58–9.87</w:t>
+            </w:r>
+          </w:p>
+        </w:tc>
+        <w:tc>
+          <w:tcPr>
+            <w:tcW w:type="dxa" w:w="2100"/>
+            <w:tcBorders>
+              <w:top w:val="single" w:color="D0D7E2" w:sz="4"/>
+              <w:left w:val="single" w:color="D0D7E2" w:sz="4"/>
+              <w:bottom w:val="single" w:color="D0D7E2" w:sz="4"/>
+              <w:right w:val="single" w:color="D0D7E2" w:sz="4"/>
+            </w:tcBorders>
+            <w:shd w:fill="FFFFFF" w:val="clear"/>
+            <w:tcMar>
+              <w:top w:type="dxa" w:w="36"/>
+              <w:left w:type="dxa" w:w="70"/>
+              <w:bottom w:type="dxa" w:w="36"/>
+              <w:right w:type="dxa" w:w="70"/>
+            </w:tcMar>
+            <w:vAlign w:val="center"/>
+          </w:tcPr>
+          <w:p>
+            <w:pPr>
+              <w:spacing w:after="0" w:before="0"/>
+              <w:jc w:val="center"/>
+            </w:pPr>
+            <w:r>
+              <w:rPr>
+                <w:rFonts w:ascii="Arial" w:cs="Arial" w:eastAsia="Arial" w:hAnsi="Arial"/>
+                <w:b w:val="false"/>
+                <w:bCs w:val="false"/>
+                <w:color w:val="222222"/>
+                <w:sz w:val="18"/>
+                <w:szCs w:val="18"/>
+              </w:rPr>
+              <w:t xml:space="preserve">40 / 10</w:t>
+            </w:r>
+          </w:p>
+        </w:tc>
+      </w:tr>
+      <w:tr>
+        <w:trPr>
+          <w:cantSplit/>
+        </w:trPr>
+        <w:tc>
+          <w:tcPr>
+            <w:tcW w:type="dxa" w:w="2080"/>
+            <w:tcBorders>
+              <w:top w:val="single" w:color="D0D7E2" w:sz="4"/>
+              <w:left w:val="single" w:color="D0D7E2" w:sz="4"/>
+              <w:bottom w:val="single" w:color="D0D7E2" w:sz="4"/>
+              <w:right w:val="single" w:color="D0D7E2" w:sz="4"/>
+            </w:tcBorders>
+            <w:shd w:fill="F7F9FC" w:val="clear"/>
+            <w:tcMar>
+              <w:top w:type="dxa" w:w="36"/>
+              <w:left w:type="dxa" w:w="70"/>
+              <w:bottom w:type="dxa" w:w="36"/>
+              <w:right w:type="dxa" w:w="70"/>
+            </w:tcMar>
+            <w:vAlign w:val="center"/>
+          </w:tcPr>
+          <w:p>
+            <w:pPr>
+              <w:spacing w:after="0" w:before="0"/>
+              <w:jc w:val="left"/>
+            </w:pPr>
+            <w:r>
+              <w:rPr>
+                <w:rFonts w:ascii="Arial" w:cs="Arial" w:eastAsia="Arial" w:hAnsi="Arial"/>
+                <w:b w:val="false"/>
+                <w:bCs w:val="false"/>
+                <w:color w:val="222222"/>
+                <w:sz w:val="18"/>
+                <w:szCs w:val="18"/>
+              </w:rPr>
+              <w:t xml:space="preserve">Walking</w:t>
+            </w:r>
+          </w:p>
+        </w:tc>
+        <w:tc>
+          <w:tcPr>
+            <w:tcW w:type="dxa" w:w="1400"/>
+            <w:tcBorders>
+              <w:top w:val="single" w:color="D0D7E2" w:sz="4"/>
+              <w:left w:val="single" w:color="D0D7E2" w:sz="4"/>
+              <w:bottom w:val="single" w:color="D0D7E2" w:sz="4"/>
+              <w:right w:val="single" w:color="D0D7E2" w:sz="4"/>
+            </w:tcBorders>
+            <w:shd w:fill="F7F9FC" w:val="clear"/>
+            <w:tcMar>
+              <w:top w:type="dxa" w:w="36"/>
+              <w:left w:type="dxa" w:w="70"/>
+              <w:bottom w:type="dxa" w:w="36"/>
+              <w:right w:type="dxa" w:w="70"/>
+            </w:tcMar>
+            <w:vAlign w:val="center"/>
+          </w:tcPr>
+          <w:p>
+            <w:pPr>
+              <w:spacing w:after="0" w:before="0"/>
+              <w:jc w:val="center"/>
+            </w:pPr>
+            <w:r>
+              <w:rPr>
+                <w:rFonts w:ascii="Arial" w:cs="Arial" w:eastAsia="Arial" w:hAnsi="Arial"/>
+                <w:b w:val="false"/>
+                <w:bCs w:val="false"/>
+                <w:color w:val="222222"/>
+                <w:sz w:val="18"/>
+                <w:szCs w:val="18"/>
+              </w:rPr>
+              <w:t xml:space="preserve">50</w:t>
+            </w:r>
+          </w:p>
+        </w:tc>
+        <w:tc>
+          <w:tcPr>
+            <w:tcW w:type="dxa" w:w="1900"/>
+            <w:tcBorders>
+              <w:top w:val="single" w:color="D0D7E2" w:sz="4"/>
+              <w:left w:val="single" w:color="D0D7E2" w:sz="4"/>
+              <w:bottom w:val="single" w:color="D0D7E2" w:sz="4"/>
+              <w:right w:val="single" w:color="D0D7E2" w:sz="4"/>
+            </w:tcBorders>
+            <w:shd w:fill="F7F9FC" w:val="clear"/>
+            <w:tcMar>
+              <w:top w:type="dxa" w:w="36"/>
+              <w:left w:type="dxa" w:w="70"/>
+              <w:bottom w:type="dxa" w:w="36"/>
+              <w:right w:type="dxa" w:w="70"/>
+            </w:tcMar>
+            <w:vAlign w:val="center"/>
+          </w:tcPr>
+          <w:p>
+            <w:pPr>
+              <w:spacing w:after="0" w:before="0"/>
+              <w:jc w:val="center"/>
+            </w:pPr>
+            <w:r>
+              <w:rPr>
+                <w:rFonts w:ascii="Arial" w:cs="Arial" w:eastAsia="Arial" w:hAnsi="Arial"/>
+                <w:b w:val="false"/>
+                <w:bCs w:val="false"/>
+                <w:color w:val="222222"/>
+                <w:sz w:val="18"/>
+                <w:szCs w:val="18"/>
+              </w:rPr>
+              <w:t xml:space="preserve">393.0</w:t>
+            </w:r>
+          </w:p>
+        </w:tc>
+        <w:tc>
+          <w:tcPr>
+            <w:tcW w:type="dxa" w:w="2600"/>
+            <w:tcBorders>
+              <w:top w:val="single" w:color="D0D7E2" w:sz="4"/>
+              <w:left w:val="single" w:color="D0D7E2" w:sz="4"/>
+              <w:bottom w:val="single" w:color="D0D7E2" w:sz="4"/>
+              <w:right w:val="single" w:color="D0D7E2" w:sz="4"/>
+            </w:tcBorders>
+            <w:shd w:fill="F7F9FC" w:val="clear"/>
+            <w:tcMar>
+              <w:top w:type="dxa" w:w="36"/>
+              <w:left w:type="dxa" w:w="70"/>
+              <w:bottom w:type="dxa" w:w="36"/>
+              <w:right w:type="dxa" w:w="70"/>
+            </w:tcMar>
+            <w:vAlign w:val="center"/>
+          </w:tcPr>
+          <w:p>
+            <w:pPr>
+              <w:spacing w:after="0" w:before="0"/>
+              <w:jc w:val="center"/>
+            </w:pPr>
+            <w:r>
+              <w:rPr>
+                <w:rFonts w:ascii="Arial" w:cs="Arial" w:eastAsia="Arial" w:hAnsi="Arial"/>
+                <w:b w:val="false"/>
+                <w:bCs w:val="false"/>
+                <w:color w:val="222222"/>
+                <w:sz w:val="18"/>
+                <w:szCs w:val="18"/>
+              </w:rPr>
+              <w:t xml:space="preserve">7.21–8.68</w:t>
+            </w:r>
+          </w:p>
+        </w:tc>
+        <w:tc>
+          <w:tcPr>
+            <w:tcW w:type="dxa" w:w="2100"/>
+            <w:tcBorders>
+              <w:top w:val="single" w:color="D0D7E2" w:sz="4"/>
+              <w:left w:val="single" w:color="D0D7E2" w:sz="4"/>
+              <w:bottom w:val="single" w:color="D0D7E2" w:sz="4"/>
+              <w:right w:val="single" w:color="D0D7E2" w:sz="4"/>
+            </w:tcBorders>
+            <w:shd w:fill="F7F9FC" w:val="clear"/>
+            <w:tcMar>
+              <w:top w:type="dxa" w:w="36"/>
+              <w:left w:type="dxa" w:w="70"/>
+              <w:bottom w:type="dxa" w:w="36"/>
+              <w:right w:type="dxa" w:w="70"/>
+            </w:tcMar>
+            <w:vAlign w:val="center"/>
+          </w:tcPr>
+          <w:p>
+            <w:pPr>
+              <w:spacing w:after="0" w:before="0"/>
+              <w:jc w:val="center"/>
+            </w:pPr>
+            <w:r>
+              <w:rPr>
+                <w:rFonts w:ascii="Arial" w:cs="Arial" w:eastAsia="Arial" w:hAnsi="Arial"/>
+                <w:b w:val="false"/>
+                <w:bCs w:val="false"/>
+                <w:color w:val="222222"/>
+                <w:sz w:val="18"/>
+                <w:szCs w:val="18"/>
+              </w:rPr>
+              <w:t xml:space="preserve">40 / 10</w:t>
+            </w:r>
+          </w:p>
+        </w:tc>
+      </w:tr>
+      <w:tr>
+        <w:trPr>
+          <w:cantSplit/>
+        </w:trPr>
+        <w:tc>
+          <w:tcPr>
+            <w:tcW w:type="dxa" w:w="2080"/>
+            <w:tcBorders>
+              <w:top w:val="single" w:color="D0D7E2" w:sz="4"/>
+              <w:left w:val="single" w:color="D0D7E2" w:sz="4"/>
+              <w:bottom w:val="single" w:color="D0D7E2" w:sz="4"/>
+              <w:right w:val="single" w:color="D0D7E2" w:sz="4"/>
+            </w:tcBorders>
+            <w:shd w:fill="FFFFFF" w:val="clear"/>
+            <w:tcMar>
+              <w:top w:type="dxa" w:w="36"/>
+              <w:left w:type="dxa" w:w="70"/>
+              <w:bottom w:type="dxa" w:w="36"/>
+              <w:right w:type="dxa" w:w="70"/>
+            </w:tcMar>
+            <w:vAlign w:val="center"/>
+          </w:tcPr>
+          <w:p>
+            <w:pPr>
+              <w:spacing w:after="0" w:before="0"/>
+              <w:jc w:val="left"/>
+            </w:pPr>
+            <w:r>
+              <w:rPr>
+                <w:rFonts w:ascii="Arial" w:cs="Arial" w:eastAsia="Arial" w:hAnsi="Arial"/>
+                <w:b w:val="false"/>
+                <w:bCs w:val="false"/>
+                <w:color w:val="222222"/>
+                <w:sz w:val="18"/>
+                <w:szCs w:val="18"/>
+              </w:rPr>
+              <w:t xml:space="preserve">Jumping</w:t>
+            </w:r>
+          </w:p>
+        </w:tc>
+        <w:tc>
+          <w:tcPr>
+            <w:tcW w:type="dxa" w:w="1400"/>
+            <w:tcBorders>
+              <w:top w:val="single" w:color="D0D7E2" w:sz="4"/>
+              <w:left w:val="single" w:color="D0D7E2" w:sz="4"/>
+              <w:bottom w:val="single" w:color="D0D7E2" w:sz="4"/>
+              <w:right w:val="single" w:color="D0D7E2" w:sz="4"/>
+            </w:tcBorders>
+            <w:shd w:fill="FFFFFF" w:val="clear"/>
+            <w:tcMar>
+              <w:top w:type="dxa" w:w="36"/>
+              <w:left w:type="dxa" w:w="70"/>
+              <w:bottom w:type="dxa" w:w="36"/>
+              <w:right w:type="dxa" w:w="70"/>
+            </w:tcMar>
+            <w:vAlign w:val="center"/>
+          </w:tcPr>
+          <w:p>
+            <w:pPr>
+              <w:spacing w:after="0" w:before="0"/>
+              <w:jc w:val="center"/>
+            </w:pPr>
+            <w:r>
+              <w:rPr>
+                <w:rFonts w:ascii="Arial" w:cs="Arial" w:eastAsia="Arial" w:hAnsi="Arial"/>
+                <w:b w:val="false"/>
+                <w:bCs w:val="false"/>
+                <w:color w:val="222222"/>
+                <w:sz w:val="18"/>
+                <w:szCs w:val="18"/>
+              </w:rPr>
+              <w:t xml:space="preserve">50</w:t>
+            </w:r>
+          </w:p>
+        </w:tc>
+        <w:tc>
+          <w:tcPr>
+            <w:tcW w:type="dxa" w:w="1900"/>
+            <w:tcBorders>
+              <w:top w:val="single" w:color="D0D7E2" w:sz="4"/>
+              <w:left w:val="single" w:color="D0D7E2" w:sz="4"/>
+              <w:bottom w:val="single" w:color="D0D7E2" w:sz="4"/>
+              <w:right w:val="single" w:color="D0D7E2" w:sz="4"/>
+            </w:tcBorders>
+            <w:shd w:fill="FFFFFF" w:val="clear"/>
+            <w:tcMar>
+              <w:top w:type="dxa" w:w="36"/>
+              <w:left w:type="dxa" w:w="70"/>
+              <w:bottom w:type="dxa" w:w="36"/>
+              <w:right w:type="dxa" w:w="70"/>
+            </w:tcMar>
+            <w:vAlign w:val="center"/>
+          </w:tcPr>
+          <w:p>
+            <w:pPr>
+              <w:spacing w:after="0" w:before="0"/>
+              <w:jc w:val="center"/>
+            </w:pPr>
+            <w:r>
+              <w:rPr>
+                <w:rFonts w:ascii="Arial" w:cs="Arial" w:eastAsia="Arial" w:hAnsi="Arial"/>
+                <w:b w:val="false"/>
+                <w:bCs w:val="false"/>
+                <w:color w:val="222222"/>
+                <w:sz w:val="18"/>
+                <w:szCs w:val="18"/>
+              </w:rPr>
+              <w:t xml:space="preserve">399.0</w:t>
+            </w:r>
+          </w:p>
+        </w:tc>
+        <w:tc>
+          <w:tcPr>
+            <w:tcW w:type="dxa" w:w="2600"/>
+            <w:tcBorders>
+              <w:top w:val="single" w:color="D0D7E2" w:sz="4"/>
+              <w:left w:val="single" w:color="D0D7E2" w:sz="4"/>
+              <w:bottom w:val="single" w:color="D0D7E2" w:sz="4"/>
+              <w:right w:val="single" w:color="D0D7E2" w:sz="4"/>
+            </w:tcBorders>
+            <w:shd w:fill="FFFFFF" w:val="clear"/>
+            <w:tcMar>
+              <w:top w:type="dxa" w:w="36"/>
+              <w:left w:type="dxa" w:w="70"/>
+              <w:bottom w:type="dxa" w:w="36"/>
+              <w:right w:type="dxa" w:w="70"/>
+            </w:tcMar>
+            <w:vAlign w:val="center"/>
+          </w:tcPr>
+          <w:p>
+            <w:pPr>
+              <w:spacing w:after="0" w:before="0"/>
+              <w:jc w:val="center"/>
+            </w:pPr>
+            <w:r>
+              <w:rPr>
+                <w:rFonts w:ascii="Arial" w:cs="Arial" w:eastAsia="Arial" w:hAnsi="Arial"/>
+                <w:b w:val="false"/>
+                <w:bCs w:val="false"/>
+                <w:color w:val="222222"/>
+                <w:sz w:val="18"/>
+                <w:szCs w:val="18"/>
+              </w:rPr>
+              <w:t xml:space="preserve">6.71–9.46</w:t>
+            </w:r>
+          </w:p>
+        </w:tc>
+        <w:tc>
+          <w:tcPr>
+            <w:tcW w:type="dxa" w:w="2100"/>
+            <w:tcBorders>
+              <w:top w:val="single" w:color="D0D7E2" w:sz="4"/>
+              <w:left w:val="single" w:color="D0D7E2" w:sz="4"/>
+              <w:bottom w:val="single" w:color="D0D7E2" w:sz="4"/>
+              <w:right w:val="single" w:color="D0D7E2" w:sz="4"/>
+            </w:tcBorders>
+            <w:shd w:fill="FFFFFF" w:val="clear"/>
+            <w:tcMar>
+              <w:top w:type="dxa" w:w="36"/>
+              <w:left w:type="dxa" w:w="70"/>
+              <w:bottom w:type="dxa" w:w="36"/>
+              <w:right w:type="dxa" w:w="70"/>
+            </w:tcMar>
+            <w:vAlign w:val="center"/>
+          </w:tcPr>
+          <w:p>
+            <w:pPr>
+              <w:spacing w:after="0" w:before="0"/>
+              <w:jc w:val="center"/>
+            </w:pPr>
+            <w:r>
+              <w:rPr>
+                <w:rFonts w:ascii="Arial" w:cs="Arial" w:eastAsia="Arial" w:hAnsi="Arial"/>
+                <w:b w:val="false"/>
+                <w:bCs w:val="false"/>
+                <w:color w:val="222222"/>
+                <w:sz w:val="18"/>
+                <w:szCs w:val="18"/>
+              </w:rPr>
+              <w:t xml:space="preserve">40 / 10</w:t>
+            </w:r>
+          </w:p>
+        </w:tc>
+      </w:tr>
+      <w:tr>
+        <w:trPr>
+          <w:cantSplit/>
+        </w:trPr>
+        <w:tc>
+          <w:tcPr>
+            <w:tcW w:type="dxa" w:w="2080"/>
+            <w:tcBorders>
+              <w:top w:val="single" w:color="D0D7E2" w:sz="4"/>
+              <w:left w:val="single" w:color="D0D7E2" w:sz="4"/>
+              <w:bottom w:val="single" w:color="D0D7E2" w:sz="4"/>
+              <w:right w:val="single" w:color="D0D7E2" w:sz="4"/>
+            </w:tcBorders>
+            <w:shd w:fill="F7F9FC" w:val="clear"/>
+            <w:tcMar>
+              <w:top w:type="dxa" w:w="36"/>
+              <w:left w:type="dxa" w:w="70"/>
+              <w:bottom w:type="dxa" w:w="36"/>
+              <w:right w:type="dxa" w:w="70"/>
+            </w:tcMar>
+            <w:vAlign w:val="center"/>
+          </w:tcPr>
+          <w:p>
+            <w:pPr>
+              <w:spacing w:after="0" w:before="0"/>
+              <w:jc w:val="left"/>
+            </w:pPr>
+            <w:r>
+              <w:rPr>
+                <w:rFonts w:ascii="Arial" w:cs="Arial" w:eastAsia="Arial" w:hAnsi="Arial"/>
+                <w:b w:val="false"/>
+                <w:bCs w:val="false"/>
+                <w:color w:val="222222"/>
+                <w:sz w:val="18"/>
+                <w:szCs w:val="18"/>
+              </w:rPr>
+              <w:t xml:space="preserve">Still</w:t>
+            </w:r>
+          </w:p>
+        </w:tc>
+        <w:tc>
+          <w:tcPr>
+            <w:tcW w:type="dxa" w:w="1400"/>
+            <w:tcBorders>
+              <w:top w:val="single" w:color="D0D7E2" w:sz="4"/>
+              <w:left w:val="single" w:color="D0D7E2" w:sz="4"/>
+              <w:bottom w:val="single" w:color="D0D7E2" w:sz="4"/>
+              <w:right w:val="single" w:color="D0D7E2" w:sz="4"/>
+            </w:tcBorders>
+            <w:shd w:fill="F7F9FC" w:val="clear"/>
+            <w:tcMar>
+              <w:top w:type="dxa" w:w="36"/>
+              <w:left w:type="dxa" w:w="70"/>
+              <w:bottom w:type="dxa" w:w="36"/>
+              <w:right w:type="dxa" w:w="70"/>
+            </w:tcMar>
+            <w:vAlign w:val="center"/>
+          </w:tcPr>
+          <w:p>
+            <w:pPr>
+              <w:spacing w:after="0" w:before="0"/>
+              <w:jc w:val="center"/>
+            </w:pPr>
+            <w:r>
+              <w:rPr>
+                <w:rFonts w:ascii="Arial" w:cs="Arial" w:eastAsia="Arial" w:hAnsi="Arial"/>
+                <w:b w:val="false"/>
+                <w:bCs w:val="false"/>
+                <w:color w:val="222222"/>
+                <w:sz w:val="18"/>
+                <w:szCs w:val="18"/>
+              </w:rPr>
+              <w:t xml:space="preserve">50</w:t>
+            </w:r>
+          </w:p>
+        </w:tc>
+        <w:tc>
+          <w:tcPr>
+            <w:tcW w:type="dxa" w:w="1900"/>
+            <w:tcBorders>
+              <w:top w:val="single" w:color="D0D7E2" w:sz="4"/>
+              <w:left w:val="single" w:color="D0D7E2" w:sz="4"/>
+              <w:bottom w:val="single" w:color="D0D7E2" w:sz="4"/>
+              <w:right w:val="single" w:color="D0D7E2" w:sz="4"/>
+            </w:tcBorders>
+            <w:shd w:fill="F7F9FC" w:val="clear"/>
+            <w:tcMar>
+              <w:top w:type="dxa" w:w="36"/>
+              <w:left w:type="dxa" w:w="70"/>
+              <w:bottom w:type="dxa" w:w="36"/>
+              <w:right w:type="dxa" w:w="70"/>
+            </w:tcMar>
+            <w:vAlign w:val="center"/>
+          </w:tcPr>
+          <w:p>
+            <w:pPr>
+              <w:spacing w:after="0" w:before="0"/>
+              <w:jc w:val="center"/>
+            </w:pPr>
+            <w:r>
+              <w:rPr>
+                <w:rFonts w:ascii="Arial" w:cs="Arial" w:eastAsia="Arial" w:hAnsi="Arial"/>
+                <w:b w:val="false"/>
+                <w:bCs w:val="false"/>
+                <w:color w:val="222222"/>
+                <w:sz w:val="18"/>
+                <w:szCs w:val="18"/>
+              </w:rPr>
+              <w:t xml:space="preserve">438.0</w:t>
+            </w:r>
+          </w:p>
+        </w:tc>
+        <w:tc>
+          <w:tcPr>
+            <w:tcW w:type="dxa" w:w="2600"/>
+            <w:tcBorders>
+              <w:top w:val="single" w:color="D0D7E2" w:sz="4"/>
+              <w:left w:val="single" w:color="D0D7E2" w:sz="4"/>
+              <w:bottom w:val="single" w:color="D0D7E2" w:sz="4"/>
+              <w:right w:val="single" w:color="D0D7E2" w:sz="4"/>
+            </w:tcBorders>
+            <w:shd w:fill="F7F9FC" w:val="clear"/>
+            <w:tcMar>
+              <w:top w:type="dxa" w:w="36"/>
+              <w:left w:type="dxa" w:w="70"/>
+              <w:bottom w:type="dxa" w:w="36"/>
+              <w:right w:type="dxa" w:w="70"/>
+            </w:tcMar>
+            <w:vAlign w:val="center"/>
+          </w:tcPr>
+          <w:p>
+            <w:pPr>
+              <w:spacing w:after="0" w:before="0"/>
+              <w:jc w:val="center"/>
+            </w:pPr>
+            <w:r>
+              <w:rPr>
+                <w:rFonts w:ascii="Arial" w:cs="Arial" w:eastAsia="Arial" w:hAnsi="Arial"/>
+                <w:b w:val="false"/>
+                <w:bCs w:val="false"/>
+                <w:color w:val="222222"/>
+                <w:sz w:val="18"/>
+                <w:szCs w:val="18"/>
+              </w:rPr>
+              <w:t xml:space="preserve">7.65–9.93</w:t>
+            </w:r>
+          </w:p>
+        </w:tc>
+        <w:tc>
+          <w:tcPr>
+            <w:tcW w:type="dxa" w:w="2100"/>
+            <w:tcBorders>
+              <w:top w:val="single" w:color="D0D7E2" w:sz="4"/>
+              <w:left w:val="single" w:color="D0D7E2" w:sz="4"/>
+              <w:bottom w:val="single" w:color="D0D7E2" w:sz="4"/>
+              <w:right w:val="single" w:color="D0D7E2" w:sz="4"/>
+            </w:tcBorders>
+            <w:shd w:fill="F7F9FC" w:val="clear"/>
+            <w:tcMar>
+              <w:top w:type="dxa" w:w="36"/>
+              <w:left w:type="dxa" w:w="70"/>
+              <w:bottom w:type="dxa" w:w="36"/>
+              <w:right w:type="dxa" w:w="70"/>
+            </w:tcMar>
+            <w:vAlign w:val="center"/>
+          </w:tcPr>
+          <w:p>
+            <w:pPr>
+              <w:spacing w:after="0" w:before="0"/>
+              <w:jc w:val="center"/>
+            </w:pPr>
+            <w:r>
+              <w:rPr>
+                <w:rFonts w:ascii="Arial" w:cs="Arial" w:eastAsia="Arial" w:hAnsi="Arial"/>
+                <w:b w:val="false"/>
+                <w:bCs w:val="false"/>
+                <w:color w:val="222222"/>
+                <w:sz w:val="18"/>
+                <w:szCs w:val="18"/>
+              </w:rPr>
+              <w:t xml:space="preserve">40 / 10</w:t>
+            </w:r>
+          </w:p>
+        </w:tc>
+      </w:tr>
+    </w:tbl>
+    <w:p>
+      <w:pPr>
+        <w:keepLines/>
+        <w:spacing w:after="120" w:before="20"/>
+        <w:jc w:val="center"/>
+      </w:pPr>
+      <w:r>
+        <w:rPr>
+          <w:rFonts w:ascii="Arial" w:cs="Arial" w:eastAsia="Arial" w:hAnsi="Arial"/>
+          <w:i/>
+          <w:iCs/>
+          <w:color w:val="444444"/>
+          <w:sz w:val="18"/>
+          <w:szCs w:val="18"/>
+        </w:rPr>
+        <w:t xml:space="preserve">Table 1. Recordings per activity. One file is one Sensor Logger export.</w:t>
       </w:r>
     </w:p>
     <w:p>
@@ -110,33 +1074,127 @@
           <w:sz w:val="22"/>
           <w:szCs w:val="22"/>
         </w:rPr>
-        <w:t xml:space="preserve">The layout follows the brief. Each activity has 50 files, and each file lasts between 6.5 and 9.5 seconds. That is 397 seconds of standing, 403 of walking, 401 of jumping, and 396 of still, all above the 90-second minimum. Sixteen longer files, about half a minute each, chain the activities in ordinary orders such as still, then standing, then walking. Those are the sequences the transition matrix can learn from. Training uses 40 single-activity files per class plus 12 mixed files. The test set is the other 10 files per class and 4 mixed files. The scaler and the model never see the test files.</w:t>
-      </w:r>
-    </w:p>
-    <w:p>
-      <w:pPr>
-        <w:spacing w:after="120" w:before="0" w:line="252"/>
-      </w:pPr>
+        <w:t xml:space="preserve">Collection videos, one per activity, with full body and face visible: Standing </w:t>
+      </w:r>
+      <w:r>
+        <w:rPr>
+          <w:rFonts w:ascii="Arial" w:cs="Arial" w:eastAsia="Arial" w:hAnsi="Arial"/>
+          <w:sz w:val="22"/>
+          <w:szCs w:val="22"/>
+          <w:highlight w:val="yellow"/>
+        </w:rPr>
+        <w:t xml:space="preserve">PASTE_LINK</w:t>
+      </w:r>
       <w:r>
         <w:rPr>
           <w:rFonts w:ascii="Arial" w:cs="Arial" w:eastAsia="Arial" w:hAnsi="Arial"/>
           <w:sz w:val="22"/>
           <w:szCs w:val="22"/>
         </w:rPr>
-        <w:t xml:space="preserve">Sampling rates are mixed on purpose: 82 files at 40 Hz, 68 at 50 Hz, and 66 at 100 Hz. Timestamps are interpolated onto one 50 Hz grid before any window is cut, so a phone that recorded faster or slower still yields the same window length. The window is 1.0 second (50 samples) and the hop is 0.5 second. A step is about half a second, so the window covers at least one step, and the native FFT bin width is 1 Hz. The hop gives the chain a new observation twice a second. The label of a window is the majority activity of its samples, so a window that straddles a change of activity is a noisy label.</w:t>
-      </w:r>
-    </w:p>
-    <w:p>
-      <w:pPr>
-        <w:spacing w:after="120" w:before="0" w:line="252"/>
-      </w:pPr>
+        <w:t xml:space="preserve">, Walking </w:t>
+      </w:r>
+      <w:r>
+        <w:rPr>
+          <w:rFonts w:ascii="Arial" w:cs="Arial" w:eastAsia="Arial" w:hAnsi="Arial"/>
+          <w:sz w:val="22"/>
+          <w:szCs w:val="22"/>
+          <w:highlight w:val="yellow"/>
+        </w:rPr>
+        <w:t xml:space="preserve">PASTE_LINK</w:t>
+      </w:r>
       <w:r>
         <w:rPr>
           <w:rFonts w:ascii="Arial" w:cs="Arial" w:eastAsia="Arial" w:hAnsi="Arial"/>
           <w:sz w:val="22"/>
           <w:szCs w:val="22"/>
         </w:rPr>
-        <w:t xml:space="preserve">The mean acceleration inside the window is removed and treated as gravity. Nine features are computed on what remains. Z-score mean and scale are fit on training windows only. A correlation, a frequency in hertz, and a spectral energy cannot sit in one Gaussian until they are on one scale. Test windows use that training scale and no other.</w:t>
+        <w:t xml:space="preserve">, Jumping </w:t>
+      </w:r>
+      <w:r>
+        <w:rPr>
+          <w:rFonts w:ascii="Arial" w:cs="Arial" w:eastAsia="Arial" w:hAnsi="Arial"/>
+          <w:sz w:val="22"/>
+          <w:szCs w:val="22"/>
+          <w:highlight w:val="yellow"/>
+        </w:rPr>
+        <w:t xml:space="preserve">PASTE_LINK</w:t>
+      </w:r>
+      <w:r>
+        <w:rPr>
+          <w:rFonts w:ascii="Arial" w:cs="Arial" w:eastAsia="Arial" w:hAnsi="Arial"/>
+          <w:sz w:val="22"/>
+          <w:szCs w:val="22"/>
+        </w:rPr>
+        <w:t xml:space="preserve">, Still </w:t>
+      </w:r>
+      <w:r>
+        <w:rPr>
+          <w:rFonts w:ascii="Arial" w:cs="Arial" w:eastAsia="Arial" w:hAnsi="Arial"/>
+          <w:sz w:val="22"/>
+          <w:szCs w:val="22"/>
+          <w:highlight w:val="yellow"/>
+        </w:rPr>
+        <w:t xml:space="preserve">PASTE_LINK</w:t>
+      </w:r>
+      <w:r>
+        <w:rPr>
+          <w:rFonts w:ascii="Arial" w:cs="Arial" w:eastAsia="Arial" w:hAnsi="Arial"/>
+          <w:sz w:val="22"/>
+          <w:szCs w:val="22"/>
+        </w:rPr>
+        <w:t xml:space="preserve">.</w:t>
+      </w:r>
+    </w:p>
+    <w:p>
+      <w:pPr>
+        <w:spacing w:after="120" w:before="0" w:line="252"/>
+      </w:pPr>
+      <w:r>
+        <w:rPr>
+          <w:rFonts w:ascii="Arial" w:cs="Arial" w:eastAsia="Arial" w:hAnsi="Arial"/>
+          <w:sz w:val="22"/>
+          <w:szCs w:val="22"/>
+        </w:rPr>
+        <w:t xml:space="preserve">Sensor Logger exports each recording as a zip. On iOS its accelerometer stream is user acceleration: gravity has already been removed, and the unit is m/s². Its standard deviation is about 9.8 times that of the uncalibrated stream in the same zip, which is in g, and that confirms the unit. The gyroscope is in rad/s. A converter, src/convert.py, reads both streams by axis name, keeps the span both sensors cover, puts the gyroscope on the accelerometer timestamps, starts the clock at 0 s, and writes one labelled CSV per recording plus a manifest row. No file has a gap longer than 10 ms or a repeated timestamp.</w:t>
+      </w:r>
+    </w:p>
+    <w:p>
+      <w:pPr>
+        <w:spacing w:after="120" w:before="0" w:line="252"/>
+      </w:pPr>
+      <w:r>
+        <w:rPr>
+          <w:rFonts w:ascii="Arial" w:cs="Arial" w:eastAsia="Arial" w:hAnsi="Arial"/>
+          <w:sz w:val="22"/>
+          <w:szCs w:val="22"/>
+        </w:rPr>
+        <w:t xml:space="preserve">There is one phone, so there is one rate to report: 100 Hz. The brief asks for rates to be harmonised across phones, so every file is linearly interpolated onto a 50 Hz grid before any window is cut. A second phone at 50 or 60 Hz would then give the same window length with no other change; for this phone the step is a downsample by two. The window is 1.0 second (50 samples) and the hop is 0.5 second. A walking step takes about half a second and the measured jump rate is about 1.5 per second, so every window holds at least one step or one jump, the native FFT bin is 1 Hz, and the chain gets a new observation twice a second.</w:t>
+      </w:r>
+    </w:p>
+    <w:p>
+      <w:pPr>
+        <w:spacing w:after="120" w:before="0" w:line="252"/>
+      </w:pPr>
+      <w:r>
+        <w:rPr>
+          <w:rFonts w:ascii="Arial" w:cs="Arial" w:eastAsia="Arial" w:hAnsi="Arial"/>
+          <w:sz w:val="22"/>
+          <w:szCs w:val="22"/>
+        </w:rPr>
+        <w:t xml:space="preserve">The unseen test set is the last 10 recordings of each activity, by start time. They were made after every training file of the same activity, so no test window sits between two training windows in time. The scaler and the model are fitted on the other 40 files of each activity, which give 2,467 training windows.</w:t>
+      </w:r>
+    </w:p>
+    <w:p>
+      <w:pPr>
+        <w:spacing w:after="120" w:before="0" w:line="252"/>
+      </w:pPr>
+      <w:r>
+        <w:rPr>
+          <w:rFonts w:ascii="Arial" w:cs="Arial" w:eastAsia="Arial" w:hAnsi="Arial"/>
+          <w:sz w:val="22"/>
+          <w:szCs w:val="22"/>
+        </w:rPr>
+        <w:t xml:space="preserve">Each window gives nine features (Table 2). First the mean acceleration of the window is subtracted, so the features describe motion rather than the tilt of the phone. Six features are time-domain and three come from an FFT of the window, zero-padded to eight times its length. Six of them are sizes, and on this data they span about seven orders of magnitude: the training mean of spectral energy is 0.0008 for still and 13,454 for jumping. A z-score over that range is set by jumping alone, and it leaves standing and still closer together than the variance floor of one Gaussian. Those six features therefore go through log10 first. Every feature is then z-scored with the mean and standard deviation of the training windows only, and test windows reuse those values. Without the log, Baum-Welch merges standing and still, and held-out accuracy falls from 1.000 to 0.862.</w:t>
       </w:r>
     </w:p>
     <w:tbl>
@@ -153,8 +1211,8 @@
       </w:tblPr>
       <w:tblGrid>
         <w:gridCol w:w="2400"/>
-        <w:gridCol w:w="1400"/>
-        <w:gridCol w:w="6280"/>
+        <w:gridCol w:w="1300"/>
+        <w:gridCol w:w="6380"/>
       </w:tblGrid>
       <w:tr>
         <w:trPr>
@@ -190,8 +1248,8 @@
                 <w:b/>
                 <w:bCs/>
                 <w:color w:val="1F4E79"/>
-                <w:sz w:val="18"/>
-                <w:szCs w:val="18"/>
+                <w:sz w:val="17"/>
+                <w:szCs w:val="17"/>
               </w:rPr>
               <w:t xml:space="preserve">Feature</w:t>
             </w:r>
@@ -199,7 +1257,7 @@
         </w:tc>
         <w:tc>
           <w:tcPr>
-            <w:tcW w:type="dxa" w:w="1400"/>
+            <w:tcW w:type="dxa" w:w="1300"/>
             <w:tcBorders>
               <w:top w:val="single" w:color="D0D7E2" w:sz="4"/>
               <w:left w:val="single" w:color="D0D7E2" w:sz="4"/>
@@ -226,8 +1284,8 @@
                 <w:b/>
                 <w:bCs/>
                 <w:color w:val="1F4E79"/>
-                <w:sz w:val="18"/>
-                <w:szCs w:val="18"/>
+                <w:sz w:val="17"/>
+                <w:szCs w:val="17"/>
               </w:rPr>
               <w:t xml:space="preserve">Domain</w:t>
             </w:r>
@@ -235,7 +1293,7 @@
         </w:tc>
         <w:tc>
           <w:tcPr>
-            <w:tcW w:type="dxa" w:w="6280"/>
+            <w:tcW w:type="dxa" w:w="6380"/>
             <w:tcBorders>
               <w:top w:val="single" w:color="D0D7E2" w:sz="4"/>
               <w:left w:val="single" w:color="D0D7E2" w:sz="4"/>
@@ -262,10 +1320,10 @@
                 <w:b/>
                 <w:bCs/>
                 <w:color w:val="1F4E79"/>
-                <w:sz w:val="18"/>
-                <w:szCs w:val="18"/>
-              </w:rPr>
-              <w:t xml:space="preserve">Why it is in the model</w:t>
+                <w:sz w:val="17"/>
+                <w:szCs w:val="17"/>
+              </w:rPr>
+              <w:t xml:space="preserve">Why it is in the model (training means)</w:t>
             </w:r>
           </w:p>
         </w:tc>
@@ -306,13 +1364,13 @@
                 <w:sz w:val="17"/>
                 <w:szCs w:val="17"/>
               </w:rPr>
-              <w:t xml:space="preserve">acc_mag_mean</w:t>
-            </w:r>
-          </w:p>
-        </w:tc>
-        <w:tc>
-          <w:tcPr>
-            <w:tcW w:type="dxa" w:w="1400"/>
+              <w:t xml:space="preserve">log acc_mag_mean</w:t>
+            </w:r>
+          </w:p>
+        </w:tc>
+        <w:tc>
+          <w:tcPr>
+            <w:tcW w:type="dxa" w:w="1300"/>
             <w:tcBorders>
               <w:top w:val="single" w:color="D0D7E2" w:sz="4"/>
               <w:left w:val="single" w:color="D0D7E2" w:sz="4"/>
@@ -348,7 +1406,7 @@
         </w:tc>
         <w:tc>
           <w:tcPr>
-            <w:tcW w:type="dxa" w:w="6280"/>
+            <w:tcW w:type="dxa" w:w="6380"/>
             <w:tcBorders>
               <w:top w:val="single" w:color="D0D7E2" w:sz="4"/>
               <w:left w:val="single" w:color="D0D7E2" w:sz="4"/>
@@ -378,7 +1436,7 @@
                 <w:sz w:val="17"/>
                 <w:szCs w:val="17"/>
               </w:rPr>
-              <w:t xml:space="preserve">Mean size of motion after gravity is removed. Rest sits near zero.</w:t>
+              <w:t xml:space="preserve">Mean size of motion after gravity is removed: 0.009 m/s² still, 0.10 standing, 1.06 walking, 13.3 jumping.</w:t>
             </w:r>
           </w:p>
         </w:tc>
@@ -419,13 +1477,13 @@
                 <w:sz w:val="17"/>
                 <w:szCs w:val="17"/>
               </w:rPr>
-              <w:t xml:space="preserve">acc_mag_var</w:t>
-            </w:r>
-          </w:p>
-        </w:tc>
-        <w:tc>
-          <w:tcPr>
-            <w:tcW w:type="dxa" w:w="1400"/>
+              <w:t xml:space="preserve">log acc_mag_var</w:t>
+            </w:r>
+          </w:p>
+        </w:tc>
+        <w:tc>
+          <w:tcPr>
+            <w:tcW w:type="dxa" w:w="1300"/>
             <w:tcBorders>
               <w:top w:val="single" w:color="D0D7E2" w:sz="4"/>
               <w:left w:val="single" w:color="D0D7E2" w:sz="4"/>
@@ -461,7 +1519,7 @@
         </w:tc>
         <w:tc>
           <w:tcPr>
-            <w:tcW w:type="dxa" w:w="6280"/>
+            <w:tcW w:type="dxa" w:w="6380"/>
             <w:tcBorders>
               <w:top w:val="single" w:color="D0D7E2" w:sz="4"/>
               <w:left w:val="single" w:color="D0D7E2" w:sz="4"/>
@@ -491,7 +1549,7 @@
                 <w:sz w:val="17"/>
                 <w:szCs w:val="17"/>
               </w:rPr>
-              <w:t xml:space="preserve">Spread of that magnitude. A landing is a spike. Sway is not.</w:t>
+              <w:t xml:space="preserve">Spread of that magnitude. A landing is a spike; sway is not.</w:t>
             </w:r>
           </w:p>
         </w:tc>
@@ -532,13 +1590,13 @@
                 <w:sz w:val="17"/>
                 <w:szCs w:val="17"/>
               </w:rPr>
-              <w:t xml:space="preserve">acc_mag_rms</w:t>
-            </w:r>
-          </w:p>
-        </w:tc>
-        <w:tc>
-          <w:tcPr>
-            <w:tcW w:type="dxa" w:w="1400"/>
+              <w:t xml:space="preserve">log acc_mag_rms</w:t>
+            </w:r>
+          </w:p>
+        </w:tc>
+        <w:tc>
+          <w:tcPr>
+            <w:tcW w:type="dxa" w:w="1300"/>
             <w:tcBorders>
               <w:top w:val="single" w:color="D0D7E2" w:sz="4"/>
               <w:left w:val="single" w:color="D0D7E2" w:sz="4"/>
@@ -574,7 +1632,7 @@
         </w:tc>
         <w:tc>
           <w:tcPr>
-            <w:tcW w:type="dxa" w:w="6280"/>
+            <w:tcW w:type="dxa" w:w="6380"/>
             <w:tcBorders>
               <w:top w:val="single" w:color="D0D7E2" w:sz="4"/>
               <w:left w:val="single" w:color="D0D7E2" w:sz="4"/>
@@ -645,13 +1703,13 @@
                 <w:sz w:val="17"/>
                 <w:szCs w:val="17"/>
               </w:rPr>
-              <w:t xml:space="preserve">sma</w:t>
-            </w:r>
-          </w:p>
-        </w:tc>
-        <w:tc>
-          <w:tcPr>
-            <w:tcW w:type="dxa" w:w="1400"/>
+              <w:t xml:space="preserve">log sma</w:t>
+            </w:r>
+          </w:p>
+        </w:tc>
+        <w:tc>
+          <w:tcPr>
+            <w:tcW w:type="dxa" w:w="1300"/>
             <w:tcBorders>
               <w:top w:val="single" w:color="D0D7E2" w:sz="4"/>
               <w:left w:val="single" w:color="D0D7E2" w:sz="4"/>
@@ -687,7 +1745,7 @@
         </w:tc>
         <w:tc>
           <w:tcPr>
-            <w:tcW w:type="dxa" w:w="6280"/>
+            <w:tcW w:type="dxa" w:w="6380"/>
             <w:tcBorders>
               <w:top w:val="single" w:color="D0D7E2" w:sz="4"/>
               <w:left w:val="single" w:color="D0D7E2" w:sz="4"/>
@@ -717,7 +1775,7 @@
                 <w:sz w:val="17"/>
                 <w:szCs w:val="17"/>
               </w:rPr>
-              <w:t xml:space="preserve">Signal magnitude area. Motion on any axis counts, not only the largest one.</w:t>
+              <w:t xml:space="preserve">Signal magnitude area: motion on any axis counts, not only the largest.</w:t>
             </w:r>
           </w:p>
         </w:tc>
@@ -764,7 +1822,7 @@
         </w:tc>
         <w:tc>
           <w:tcPr>
-            <w:tcW w:type="dxa" w:w="1400"/>
+            <w:tcW w:type="dxa" w:w="1300"/>
             <w:tcBorders>
               <w:top w:val="single" w:color="D0D7E2" w:sz="4"/>
               <w:left w:val="single" w:color="D0D7E2" w:sz="4"/>
@@ -800,7 +1858,7 @@
         </w:tc>
         <w:tc>
           <w:tcPr>
-            <w:tcW w:type="dxa" w:w="6280"/>
+            <w:tcW w:type="dxa" w:w="6380"/>
             <w:tcBorders>
               <w:top w:val="single" w:color="D0D7E2" w:sz="4"/>
               <w:left w:val="single" w:color="D0D7E2" w:sz="4"/>
@@ -830,7 +1888,7 @@
                 <w:sz w:val="17"/>
                 <w:szCs w:val="17"/>
               </w:rPr>
-              <w:t xml:space="preserve">Correlation of the horizontal axes. Sway is coordinated. Noise is not.</w:t>
+              <w:t xml:space="preserve">Correlation of the two horizontal axes: near 0 at rest, 0.35 walking, 0.41 jumping.</w:t>
             </w:r>
           </w:p>
         </w:tc>
@@ -877,7 +1935,7 @@
         </w:tc>
         <w:tc>
           <w:tcPr>
-            <w:tcW w:type="dxa" w:w="1400"/>
+            <w:tcW w:type="dxa" w:w="1300"/>
             <w:tcBorders>
               <w:top w:val="single" w:color="D0D7E2" w:sz="4"/>
               <w:left w:val="single" w:color="D0D7E2" w:sz="4"/>
@@ -913,7 +1971,7 @@
         </w:tc>
         <w:tc>
           <w:tcPr>
-            <w:tcW w:type="dxa" w:w="6280"/>
+            <w:tcW w:type="dxa" w:w="6380"/>
             <w:tcBorders>
               <w:top w:val="single" w:color="D0D7E2" w:sz="4"/>
               <w:left w:val="single" w:color="D0D7E2" w:sz="4"/>
@@ -943,7 +2001,7 @@
                 <w:sz w:val="17"/>
                 <w:szCs w:val="17"/>
               </w:rPr>
-              <w:t xml:space="preserve">FFT peak on the busiest axis, or 0 Hz if no bin clears the noise floor.</w:t>
+              <w:t xml:space="preserve">FFT peak on the busiest axis, or 0 Hz below the noise floor. Weak here: it fires in 27% of walking windows.</w:t>
             </w:r>
           </w:p>
         </w:tc>
@@ -984,13 +2042,13 @@
                 <w:sz w:val="17"/>
                 <w:szCs w:val="17"/>
               </w:rPr>
-              <w:t xml:space="preserve">acc_spectral_energy</w:t>
-            </w:r>
-          </w:p>
-        </w:tc>
-        <w:tc>
-          <w:tcPr>
-            <w:tcW w:type="dxa" w:w="1400"/>
+              <w:t xml:space="preserve">log acc_spectral_energy</w:t>
+            </w:r>
+          </w:p>
+        </w:tc>
+        <w:tc>
+          <w:tcPr>
+            <w:tcW w:type="dxa" w:w="1300"/>
             <w:tcBorders>
               <w:top w:val="single" w:color="D0D7E2" w:sz="4"/>
               <w:left w:val="single" w:color="D0D7E2" w:sz="4"/>
@@ -1026,7 +2084,7 @@
         </w:tc>
         <w:tc>
           <w:tcPr>
-            <w:tcW w:type="dxa" w:w="6280"/>
+            <w:tcW w:type="dxa" w:w="6380"/>
             <w:tcBorders>
               <w:top w:val="single" w:color="D0D7E2" w:sz="4"/>
               <w:left w:val="single" w:color="D0D7E2" w:sz="4"/>
@@ -1056,7 +2114,7 @@
                 <w:sz w:val="17"/>
                 <w:szCs w:val="17"/>
               </w:rPr>
-              <w:t xml:space="preserve">FFT power from 0.15 to 8 Hz. This is what separates a jump from a step.</w:t>
+              <w:t xml:space="preserve">FFT power from 0.15 to 8 Hz of the magnitude. The widest gap between the classes.</w:t>
             </w:r>
           </w:p>
         </w:tc>
@@ -1097,13 +2155,13 @@
                 <w:sz w:val="17"/>
                 <w:szCs w:val="17"/>
               </w:rPr>
-              <w:t xml:space="preserve">gyro_mag_mean</w:t>
-            </w:r>
-          </w:p>
-        </w:tc>
-        <w:tc>
-          <w:tcPr>
-            <w:tcW w:type="dxa" w:w="1400"/>
+              <w:t xml:space="preserve">log gyro_mag_mean</w:t>
+            </w:r>
+          </w:p>
+        </w:tc>
+        <w:tc>
+          <w:tcPr>
+            <w:tcW w:type="dxa" w:w="1300"/>
             <w:tcBorders>
               <w:top w:val="single" w:color="D0D7E2" w:sz="4"/>
               <w:left w:val="single" w:color="D0D7E2" w:sz="4"/>
@@ -1139,7 +2197,7 @@
         </w:tc>
         <w:tc>
           <w:tcPr>
-            <w:tcW w:type="dxa" w:w="6280"/>
+            <w:tcW w:type="dxa" w:w="6380"/>
             <w:tcBorders>
               <w:top w:val="single" w:color="D0D7E2" w:sz="4"/>
               <w:left w:val="single" w:color="D0D7E2" w:sz="4"/>
@@ -1169,7 +2227,7 @@
                 <w:sz w:val="17"/>
                 <w:szCs w:val="17"/>
               </w:rPr>
-              <w:t xml:space="preserve">How much the phone rotates. A desk does not. A step does.</w:t>
+              <w:t xml:space="preserve">How much the phone rotates: 0.001 rad/s on the desk, 3.3 rad/s jumping.</w:t>
             </w:r>
           </w:p>
         </w:tc>
@@ -1216,7 +2274,7 @@
         </w:tc>
         <w:tc>
           <w:tcPr>
-            <w:tcW w:type="dxa" w:w="1400"/>
+            <w:tcW w:type="dxa" w:w="1300"/>
             <w:tcBorders>
               <w:top w:val="single" w:color="D0D7E2" w:sz="4"/>
               <w:left w:val="single" w:color="D0D7E2" w:sz="4"/>
@@ -1252,7 +2310,7 @@
         </w:tc>
         <w:tc>
           <w:tcPr>
-            <w:tcW w:type="dxa" w:w="6280"/>
+            <w:tcW w:type="dxa" w:w="6380"/>
             <w:tcBorders>
               <w:top w:val="single" w:color="D0D7E2" w:sz="4"/>
               <w:left w:val="single" w:color="D0D7E2" w:sz="4"/>
@@ -1282,7 +2340,7 @@
                 <w:sz w:val="17"/>
                 <w:szCs w:val="17"/>
               </w:rPr>
-              <w:t xml:space="preserve">FFT peak of the busiest gyro axis. Walking rocks the phone at the step rate.</w:t>
+              <w:t xml:space="preserve">FFT peak of the busiest gyroscope axis. Fires in 86% of jumping windows near 1.5 Hz.</w:t>
             </w:r>
           </w:p>
         </w:tc>
@@ -1290,8 +2348,21 @@
     </w:tbl>
     <w:p>
       <w:pPr>
-        <w:spacing w:after="80" w:before="60"/>
-      </w:pPr>
+        <w:keepLines/>
+        <w:spacing w:after="120" w:before="20"/>
+        <w:jc w:val="center"/>
+      </w:pPr>
+      <w:r>
+        <w:rPr>
+          <w:rFonts w:ascii="Arial" w:cs="Arial" w:eastAsia="Arial" w:hAnsi="Arial"/>
+          <w:i/>
+          <w:iCs/>
+          <w:color w:val="444444"/>
+          <w:sz w:val="18"/>
+          <w:szCs w:val="18"/>
+        </w:rPr>
+        <w:t xml:space="preserve">Table 2. The nine features. “log” marks the six that go through log10 before the z-score.</w:t>
+      </w:r>
     </w:p>
     <w:p>
       <w:pPr>
@@ -1324,7 +2395,7 @@
           <w:sz w:val="22"/>
           <w:szCs w:val="22"/>
         </w:rPr>
-        <w:t xml:space="preserve">The hidden states are standing, walking, jumping, and still. An observation is the nine-dimensional vector from one window. Each state emits a diagonal Gaussian. After z-scoring, a full covariance is unnecessary, and it would add a large number of parameters on a few thousand windows.</w:t>
+        <w:t xml:space="preserve">The hidden states Z are standing, walking, jumping, and still. An observation X is the nine-dimensional feature vector of one window. The transition matrix A gives the probability of moving from one state to another between consecutive windows, and the initial vector π gives the probability of the first state. The emission model B is a diagonal Gaussian per state over the scaled features. A diagonal covariance is enough after scaling, and it needs 18 parameters per state instead of 54.</w:t>
       </w:r>
     </w:p>
     <w:p>
@@ -1337,7 +2408,7 @@
           <w:sz w:val="22"/>
           <w:szCs w:val="22"/>
         </w:rPr>
-        <w:t xml:space="preserve">Baum-Welch learns the start vector, the transition matrix, and the Gaussian means and variances. The code is in src/hmm.py and uses NumPy only. Forward and backward messages stay in log space so a long file does not underflow. The E-step turns those messages into a posterior over states and a posterior over transitions. The M-step updates the parameters. Variance has a floor of 10⁻³ so a state cannot collapse to zero width. Every transition is floored before its row is normalized, so a log-probability stays finite. Learning stops when the relative change in total training log-likelihood falls below 10⁻⁶. On this data that happened at iteration 9. The likelihood moved from 11908.4 to 14768.9 and never decreased.</w:t>
+        <w:t xml:space="preserve">Everything is written in NumPy (src/hmm.py). Baum-Welch learns π, A, and the Gaussian means and variances. Forward and backward messages stay in log space so a long file cannot underflow. Variances have a floor of 10⁻³, and every transition is floored at 10⁻⁸ before its row is normalised, so no log-probability becomes infinite. Learning stops when the relative change in training log-likelihood falls below 10⁻⁶. On this data that took 4 iterations, from 9,189.7 to 9,471.1, and the likelihood never fell. A self-test on a two-state chain with known parameters recovers its path with accuracy 1.00 and checks that the posteriors sum to one.</w:t>
       </w:r>
     </w:p>
     <w:p>
@@ -1350,7 +2421,7 @@
           <w:sz w:val="22"/>
           <w:szCs w:val="22"/>
         </w:rPr>
-        <w:t xml:space="preserve">Initialization uses the labeled training windows, so each state starts as one activity. After EM, states are renamed by the majority training label of the Viterbi path. Test files are not used for that renaming. On this run the match was the identity: EM did not swap the activities. A separate check builds a two-state Gaussian chain with known parameters. Viterbi recovered that probe path with accuracy 1.00, the posteriors sum to one, and EM did not lower the likelihood.</w:t>
+        <w:t xml:space="preserve">Parameters start from the labelled training windows: each state's Gaussian is fitted to its own windows, and transition counts get a Dirichlet count of one so an unseen change stays possible. After EM, states are renamed by the majority training label of their Viterbi path, using training files only. The renaming was the identity: EM kept every activity in its own state.</w:t>
       </w:r>
     </w:p>
     <w:p>
@@ -1363,7 +2434,7 @@
           <w:sz w:val="22"/>
           <w:szCs w:val="22"/>
         </w:rPr>
-        <w:t xml:space="preserve">The metrics below are computed on the Viterbi path, one hard label per window. That is the label the coach would display. Forward-backward posteriors are the right quantity inside EM, where a window may belong partly to two states, but sensitivity and specificity count hard decisions. A Viterbi error is an off-diagonal cell in the confusion matrix. The labeled initialization, before any EM update, already reaches a held-out frame accuracy of 0.971. After EM the same files reach 0.997, so the update is doing real work.</w:t>
+        <w:t xml:space="preserve">Baum-Welch is the learning algorithm because a deployed phone will not have labels, and EM can keep adapting π, A, and B from unlabelled windows. Viterbi is the decoder because sensitivity, specificity, and accuracy count one hard label per window, and the Viterbi path is the single most likely sequence of those labels: the one a live display would show. Forward-backward posteriors drive the E-step and would be the right output if a window were allowed to stay uncertain, but they are not what the table counts. Every Viterbi error is one off-diagonal cell of the confusion matrix.</w:t>
       </w:r>
     </w:p>
     <w:p>
@@ -1389,6 +2460,7 @@
     </w:p>
     <w:p>
       <w:pPr>
+        <w:keepNext/>
         <w:spacing w:after="120" w:before="0" w:line="252"/>
       </w:pPr>
       <w:r>
@@ -1397,7 +2469,7 @@
           <w:sz w:val="22"/>
           <w:szCs w:val="22"/>
         </w:rPr>
-        <w:t xml:space="preserve">The single-activity test set has 40 files and 585 windows. Frame accuracy is 0.997, which is 583 of 585 windows. The majority label of each file is correct on all 40 files. Four mixed test recordings, 239 windows that were not in training, reach a frame accuracy of 0.954. Samples in the table are held-out windows.</w:t>
+        <w:t xml:space="preserve">The unseen set is 40 files and 581 windows. The Viterbi path is correct on all 581 windows, and the majority label is correct on all 40 files. Table 3 is the table the brief asks for; a sample is one held-out window. The labelled starting point already scores 1.000 before Baum-Welch, and EM changes no held-out label.</w:t>
       </w:r>
     </w:p>
     <w:tbl>
@@ -1413,11 +2485,11 @@
         </w:tblBorders>
       </w:tblPr>
       <w:tblGrid>
-        <w:gridCol w:w="1900"/>
-        <w:gridCol w:w="1600"/>
-        <w:gridCol w:w="2193"/>
-        <w:gridCol w:w="2193"/>
-        <w:gridCol w:w="2194"/>
+        <w:gridCol w:w="2080"/>
+        <w:gridCol w:w="2000"/>
+        <w:gridCol w:w="2000"/>
+        <w:gridCol w:w="2000"/>
+        <w:gridCol w:w="2000"/>
       </w:tblGrid>
       <w:tr>
         <w:trPr>
@@ -1426,7 +2498,7 @@
         </w:trPr>
         <w:tc>
           <w:tcPr>
-            <w:tcW w:type="dxa" w:w="1900"/>
+            <w:tcW w:type="dxa" w:w="2080"/>
             <w:tcBorders>
               <w:top w:val="single" w:color="D0D7E2" w:sz="4"/>
               <w:left w:val="single" w:color="D0D7E2" w:sz="4"/>
@@ -1456,13 +2528,13 @@
                 <w:sz w:val="18"/>
                 <w:szCs w:val="18"/>
               </w:rPr>
-              <w:t xml:space="preserve">Activity</w:t>
-            </w:r>
-          </w:p>
-        </w:tc>
-        <w:tc>
-          <w:tcPr>
-            <w:tcW w:type="dxa" w:w="1600"/>
+              <w:t xml:space="preserve">State (activity)</w:t>
+            </w:r>
+          </w:p>
+        </w:tc>
+        <w:tc>
+          <w:tcPr>
+            <w:tcW w:type="dxa" w:w="2000"/>
             <w:tcBorders>
               <w:top w:val="single" w:color="D0D7E2" w:sz="4"/>
               <w:left w:val="single" w:color="D0D7E2" w:sz="4"/>
@@ -1492,13 +2564,13 @@
                 <w:sz w:val="18"/>
                 <w:szCs w:val="18"/>
               </w:rPr>
-              <w:t xml:space="preserve">Samples</w:t>
-            </w:r>
-          </w:p>
-        </w:tc>
-        <w:tc>
-          <w:tcPr>
-            <w:tcW w:type="dxa" w:w="2193"/>
+              <w:t xml:space="preserve">Number of samples</w:t>
+            </w:r>
+          </w:p>
+        </w:tc>
+        <w:tc>
+          <w:tcPr>
+            <w:tcW w:type="dxa" w:w="2000"/>
             <w:tcBorders>
               <w:top w:val="single" w:color="D0D7E2" w:sz="4"/>
               <w:left w:val="single" w:color="D0D7E2" w:sz="4"/>
@@ -1534,7 +2606,7 @@
         </w:tc>
         <w:tc>
           <w:tcPr>
-            <w:tcW w:type="dxa" w:w="2193"/>
+            <w:tcW w:type="dxa" w:w="2000"/>
             <w:tcBorders>
               <w:top w:val="single" w:color="D0D7E2" w:sz="4"/>
               <w:left w:val="single" w:color="D0D7E2" w:sz="4"/>
@@ -1570,7 +2642,7 @@
         </w:tc>
         <w:tc>
           <w:tcPr>
-            <w:tcW w:type="dxa" w:w="2194"/>
+            <w:tcW w:type="dxa" w:w="2000"/>
             <w:tcBorders>
               <w:top w:val="single" w:color="D0D7E2" w:sz="4"/>
               <w:left w:val="single" w:color="D0D7E2" w:sz="4"/>
@@ -1611,7 +2683,7 @@
         </w:trPr>
         <w:tc>
           <w:tcPr>
-            <w:tcW w:type="dxa" w:w="1900"/>
+            <w:tcW w:type="dxa" w:w="2080"/>
             <w:tcBorders>
               <w:top w:val="single" w:color="D0D7E2" w:sz="4"/>
               <w:left w:val="single" w:color="D0D7E2" w:sz="4"/>
@@ -1647,7 +2719,7 @@
         </w:tc>
         <w:tc>
           <w:tcPr>
-            <w:tcW w:type="dxa" w:w="1600"/>
+            <w:tcW w:type="dxa" w:w="2000"/>
             <w:tcBorders>
               <w:top w:val="single" w:color="D0D7E2" w:sz="4"/>
               <w:left w:val="single" w:color="D0D7E2" w:sz="4"/>
@@ -1677,13 +2749,13 @@
                 <w:sz w:val="18"/>
                 <w:szCs w:val="18"/>
               </w:rPr>
-              <w:t xml:space="preserve">143</w:t>
-            </w:r>
-          </w:p>
-        </w:tc>
-        <w:tc>
-          <w:tcPr>
-            <w:tcW w:type="dxa" w:w="2193"/>
+              <w:t xml:space="preserve">138</w:t>
+            </w:r>
+          </w:p>
+        </w:tc>
+        <w:tc>
+          <w:tcPr>
+            <w:tcW w:type="dxa" w:w="2000"/>
             <w:tcBorders>
               <w:top w:val="single" w:color="D0D7E2" w:sz="4"/>
               <w:left w:val="single" w:color="D0D7E2" w:sz="4"/>
@@ -1713,13 +2785,13 @@
                 <w:sz w:val="18"/>
                 <w:szCs w:val="18"/>
               </w:rPr>
-              <w:t xml:space="preserve">0.986</w:t>
-            </w:r>
-          </w:p>
-        </w:tc>
-        <w:tc>
-          <w:tcPr>
-            <w:tcW w:type="dxa" w:w="2193"/>
+              <w:t xml:space="preserve">1.000</w:t>
+            </w:r>
+          </w:p>
+        </w:tc>
+        <w:tc>
+          <w:tcPr>
+            <w:tcW w:type="dxa" w:w="2000"/>
             <w:tcBorders>
               <w:top w:val="single" w:color="D0D7E2" w:sz="4"/>
               <w:left w:val="single" w:color="D0D7E2" w:sz="4"/>
@@ -1755,7 +2827,7 @@
         </w:tc>
         <w:tc>
           <w:tcPr>
-            <w:tcW w:type="dxa" w:w="2194"/>
+            <w:tcW w:type="dxa" w:w="2000"/>
             <w:tcBorders>
               <w:top w:val="single" w:color="D0D7E2" w:sz="4"/>
               <w:left w:val="single" w:color="D0D7E2" w:sz="4"/>
@@ -1785,7 +2857,7 @@
                 <w:sz w:val="18"/>
                 <w:szCs w:val="18"/>
               </w:rPr>
-              <w:t xml:space="preserve">0.997</w:t>
+              <w:t xml:space="preserve">1.000</w:t>
             </w:r>
           </w:p>
         </w:tc>
@@ -1796,7 +2868,7 @@
         </w:trPr>
         <w:tc>
           <w:tcPr>
-            <w:tcW w:type="dxa" w:w="1900"/>
+            <w:tcW w:type="dxa" w:w="2080"/>
             <w:tcBorders>
               <w:top w:val="single" w:color="D0D7E2" w:sz="4"/>
               <w:left w:val="single" w:color="D0D7E2" w:sz="4"/>
@@ -1832,7 +2904,7 @@
         </w:tc>
         <w:tc>
           <w:tcPr>
-            <w:tcW w:type="dxa" w:w="1600"/>
+            <w:tcW w:type="dxa" w:w="2000"/>
             <w:tcBorders>
               <w:top w:val="single" w:color="D0D7E2" w:sz="4"/>
               <w:left w:val="single" w:color="D0D7E2" w:sz="4"/>
@@ -1862,13 +2934,13 @@
                 <w:sz w:val="18"/>
                 <w:szCs w:val="18"/>
               </w:rPr>
-              <w:t xml:space="preserve">142</w:t>
-            </w:r>
-          </w:p>
-        </w:tc>
-        <w:tc>
-          <w:tcPr>
-            <w:tcW w:type="dxa" w:w="2193"/>
+              <w:t xml:space="preserve">134</w:t>
+            </w:r>
+          </w:p>
+        </w:tc>
+        <w:tc>
+          <w:tcPr>
+            <w:tcW w:type="dxa" w:w="2000"/>
             <w:tcBorders>
               <w:top w:val="single" w:color="D0D7E2" w:sz="4"/>
               <w:left w:val="single" w:color="D0D7E2" w:sz="4"/>
@@ -1904,7 +2976,7 @@
         </w:tc>
         <w:tc>
           <w:tcPr>
-            <w:tcW w:type="dxa" w:w="2193"/>
+            <w:tcW w:type="dxa" w:w="2000"/>
             <w:tcBorders>
               <w:top w:val="single" w:color="D0D7E2" w:sz="4"/>
               <w:left w:val="single" w:color="D0D7E2" w:sz="4"/>
@@ -1940,7 +3012,7 @@
         </w:tc>
         <w:tc>
           <w:tcPr>
-            <w:tcW w:type="dxa" w:w="2194"/>
+            <w:tcW w:type="dxa" w:w="2000"/>
             <w:tcBorders>
               <w:top w:val="single" w:color="D0D7E2" w:sz="4"/>
               <w:left w:val="single" w:color="D0D7E2" w:sz="4"/>
@@ -1970,7 +3042,7 @@
                 <w:sz w:val="18"/>
                 <w:szCs w:val="18"/>
               </w:rPr>
-              <w:t xml:space="preserve">0.997</w:t>
+              <w:t xml:space="preserve">1.000</w:t>
             </w:r>
           </w:p>
         </w:tc>
@@ -1981,7 +3053,7 @@
         </w:trPr>
         <w:tc>
           <w:tcPr>
-            <w:tcW w:type="dxa" w:w="1900"/>
+            <w:tcW w:type="dxa" w:w="2080"/>
             <w:tcBorders>
               <w:top w:val="single" w:color="D0D7E2" w:sz="4"/>
               <w:left w:val="single" w:color="D0D7E2" w:sz="4"/>
@@ -2017,7 +3089,7 @@
         </w:tc>
         <w:tc>
           <w:tcPr>
-            <w:tcW w:type="dxa" w:w="1600"/>
+            <w:tcW w:type="dxa" w:w="2000"/>
             <w:tcBorders>
               <w:top w:val="single" w:color="D0D7E2" w:sz="4"/>
               <w:left w:val="single" w:color="D0D7E2" w:sz="4"/>
@@ -2047,13 +3119,13 @@
                 <w:sz w:val="18"/>
                 <w:szCs w:val="18"/>
               </w:rPr>
-              <w:t xml:space="preserve">151</w:t>
-            </w:r>
-          </w:p>
-        </w:tc>
-        <w:tc>
-          <w:tcPr>
-            <w:tcW w:type="dxa" w:w="2193"/>
+              <w:t xml:space="preserve">149</w:t>
+            </w:r>
+          </w:p>
+        </w:tc>
+        <w:tc>
+          <w:tcPr>
+            <w:tcW w:type="dxa" w:w="2000"/>
             <w:tcBorders>
               <w:top w:val="single" w:color="D0D7E2" w:sz="4"/>
               <w:left w:val="single" w:color="D0D7E2" w:sz="4"/>
@@ -2089,7 +3161,7 @@
         </w:tc>
         <w:tc>
           <w:tcPr>
-            <w:tcW w:type="dxa" w:w="2193"/>
+            <w:tcW w:type="dxa" w:w="2000"/>
             <w:tcBorders>
               <w:top w:val="single" w:color="D0D7E2" w:sz="4"/>
               <w:left w:val="single" w:color="D0D7E2" w:sz="4"/>
@@ -2125,7 +3197,7 @@
         </w:tc>
         <w:tc>
           <w:tcPr>
-            <w:tcW w:type="dxa" w:w="2194"/>
+            <w:tcW w:type="dxa" w:w="2000"/>
             <w:tcBorders>
               <w:top w:val="single" w:color="D0D7E2" w:sz="4"/>
               <w:left w:val="single" w:color="D0D7E2" w:sz="4"/>
@@ -2155,7 +3227,7 @@
                 <w:sz w:val="18"/>
                 <w:szCs w:val="18"/>
               </w:rPr>
-              <w:t xml:space="preserve">0.997</w:t>
+              <w:t xml:space="preserve">1.000</w:t>
             </w:r>
           </w:p>
         </w:tc>
@@ -2166,7 +3238,7 @@
         </w:trPr>
         <w:tc>
           <w:tcPr>
-            <w:tcW w:type="dxa" w:w="1900"/>
+            <w:tcW w:type="dxa" w:w="2080"/>
             <w:tcBorders>
               <w:top w:val="single" w:color="D0D7E2" w:sz="4"/>
               <w:left w:val="single" w:color="D0D7E2" w:sz="4"/>
@@ -2202,7 +3274,7 @@
         </w:tc>
         <w:tc>
           <w:tcPr>
-            <w:tcW w:type="dxa" w:w="1600"/>
+            <w:tcW w:type="dxa" w:w="2000"/>
             <w:tcBorders>
               <w:top w:val="single" w:color="D0D7E2" w:sz="4"/>
               <w:left w:val="single" w:color="D0D7E2" w:sz="4"/>
@@ -2232,13 +3304,13 @@
                 <w:sz w:val="18"/>
                 <w:szCs w:val="18"/>
               </w:rPr>
-              <w:t xml:space="preserve">149</w:t>
-            </w:r>
-          </w:p>
-        </w:tc>
-        <w:tc>
-          <w:tcPr>
-            <w:tcW w:type="dxa" w:w="2193"/>
+              <w:t xml:space="preserve">160</w:t>
+            </w:r>
+          </w:p>
+        </w:tc>
+        <w:tc>
+          <w:tcPr>
+            <w:tcW w:type="dxa" w:w="2000"/>
             <w:tcBorders>
               <w:top w:val="single" w:color="D0D7E2" w:sz="4"/>
               <w:left w:val="single" w:color="D0D7E2" w:sz="4"/>
@@ -2274,7 +3346,7 @@
         </w:tc>
         <w:tc>
           <w:tcPr>
-            <w:tcW w:type="dxa" w:w="2193"/>
+            <w:tcW w:type="dxa" w:w="2000"/>
             <w:tcBorders>
               <w:top w:val="single" w:color="D0D7E2" w:sz="4"/>
               <w:left w:val="single" w:color="D0D7E2" w:sz="4"/>
@@ -2304,13 +3376,13 @@
                 <w:sz w:val="18"/>
                 <w:szCs w:val="18"/>
               </w:rPr>
-              <w:t xml:space="preserve">0.995</w:t>
-            </w:r>
-          </w:p>
-        </w:tc>
-        <w:tc>
-          <w:tcPr>
-            <w:tcW w:type="dxa" w:w="2194"/>
+              <w:t xml:space="preserve">1.000</w:t>
+            </w:r>
+          </w:p>
+        </w:tc>
+        <w:tc>
+          <w:tcPr>
+            <w:tcW w:type="dxa" w:w="2000"/>
             <w:tcBorders>
               <w:top w:val="single" w:color="D0D7E2" w:sz="4"/>
               <w:left w:val="single" w:color="D0D7E2" w:sz="4"/>
@@ -2340,7 +3412,7 @@
                 <w:sz w:val="18"/>
                 <w:szCs w:val="18"/>
               </w:rPr>
-              <w:t xml:space="preserve">0.997</w:t>
+              <w:t xml:space="preserve">1.000</w:t>
             </w:r>
           </w:p>
         </w:tc>
@@ -2361,20 +3433,7 @@
           <w:sz w:val="18"/>
           <w:szCs w:val="18"/>
         </w:rPr>
-        <w:t xml:space="preserve">Table 1. One-versus-rest sensitivity and specificity on the 40 held-out single-activity files. Overall accuracy is the same quantity on every row.</w:t>
-      </w:r>
-    </w:p>
-    <w:p>
-      <w:pPr>
-        <w:spacing w:after="120" w:before="0" w:line="252"/>
-      </w:pPr>
-      <w:r>
-        <w:rPr>
-          <w:rFonts w:ascii="Arial" w:cs="Arial" w:eastAsia="Arial" w:hAnsi="Arial"/>
-          <w:sz w:val="22"/>
-          <w:szCs w:val="22"/>
-        </w:rPr>
-        <w:t xml:space="preserve">Walking and jumping are exact on these files. The only mistakes are two standing windows called still. Still therefore has a specificity of 0.995, and standing has a sensitivity of 0.986. No held-out rest window was called walking or jumping.</w:t>
+        <w:t xml:space="preserve">Table 3. One-versus-rest sensitivity and specificity on the 40 unseen files. Overall accuracy is the same quantity on every row.</w:t>
       </w:r>
     </w:p>
     <w:p>
@@ -2386,9 +3445,9 @@
       <w:r>
         <w:drawing>
           <wp:inline distT="0" distB="0" distL="0" distR="0">
-            <wp:extent cx="5143500" cy="4010025"/>
+            <wp:extent cx="3840480" cy="2997447"/>
             <wp:effectExtent t="0" r="0" b="0" l="0"/>
-            <wp:docPr id="1" name="Four accelerometer magnitude traces on one shared vertical scale" descr="Four accelerometer magnitude traces on one shared vertical scale" title="Four accelerometer magnitude traces on one shared vertical scale"/>
+            <wp:docPr id="1" name="Accelerometer magnitude for one unseen file per activity on a log scale" descr="Accelerometer magnitude for one unseen file per activity on a log scale" title="Accelerometer magnitude for one unseen file per activity on a log scale"/>
             <wp:cNvGraphicFramePr>
               <a:graphicFrameLocks xmlns:a="http://schemas.openxmlformats.org/drawingml/2006/main" noChangeAspect="1"/>
             </wp:cNvGraphicFramePr>
@@ -2402,7 +3461,7 @@
                     </pic:cNvPicPr>
                   </pic:nvPicPr>
                   <pic:blipFill>
-                    <a:blip r:embed="rId9" cstate="none"/>
+                    <a:blip r:embed="rId30" cstate="none"/>
                     <a:srcRect/>
                     <a:stretch>
                       <a:fillRect/>
@@ -2411,7 +3470,7 @@
                   <pic:spPr bwMode="auto">
                     <a:xfrm>
                       <a:off x="0" y="0"/>
-                      <a:ext cx="5143500" cy="4010025"/>
+                      <a:ext cx="3840480" cy="2997447"/>
                     </a:xfrm>
                     <a:prstGeom prst="rect">
                       <a:avLst/>
@@ -2439,7 +3498,7 @@
           <w:sz w:val="18"/>
           <w:szCs w:val="18"/>
         </w:rPr>
-        <w:t xml:space="preserve">Figure 1. Accelerometer magnitude for one held-out file of each activity, resampled to 50 Hz and drawn on one vertical scale. Standing and still sit on gravity. Walking oscillates. Jumping is a series of impacts.</w:t>
+        <w:t xml:space="preserve">Figure 1. Accelerometer magnitude without gravity for one unseen file per activity, resampled to 50 Hz, on one logarithmic scale. Still sits at the sensor noise floor near 0.01 m/s², standing sways around 0.1, walking moves around 1, and every jump lands as a spike near 100 m/s².</w:t>
       </w:r>
     </w:p>
     <w:p>
@@ -2451,9 +3510,9 @@
       <w:r>
         <w:drawing>
           <wp:inline distT="0" distB="0" distL="0" distR="0">
-            <wp:extent cx="3810000" cy="3190875"/>
+            <wp:extent cx="6217920" cy="2605604"/>
             <wp:effectExtent t="0" r="0" b="0" l="0"/>
-            <wp:docPr id="2" name="Heatmap of the learned transition matrix" descr="Heatmap of the learned transition matrix" title="Heatmap of the learned transition matrix"/>
+            <wp:docPr id="2" name="Emission Gaussian mean and standard deviation per state and feature" descr="Emission Gaussian mean and standard deviation per state and feature" title="Emission Gaussian mean and standard deviation per state and feature"/>
             <wp:cNvGraphicFramePr>
               <a:graphicFrameLocks xmlns:a="http://schemas.openxmlformats.org/drawingml/2006/main" noChangeAspect="1"/>
             </wp:cNvGraphicFramePr>
@@ -2467,7 +3526,7 @@
                     </pic:cNvPicPr>
                   </pic:nvPicPr>
                   <pic:blipFill>
-                    <a:blip r:embed="rId10" cstate="none"/>
+                    <a:blip r:embed="rId31" cstate="none"/>
                     <a:srcRect/>
                     <a:stretch>
                       <a:fillRect/>
@@ -2476,7 +3535,7 @@
                   <pic:spPr bwMode="auto">
                     <a:xfrm>
                       <a:off x="0" y="0"/>
-                      <a:ext cx="3810000" cy="3190875"/>
+                      <a:ext cx="6217920" cy="2605604"/>
                     </a:xfrm>
                     <a:prstGeom prst="rect">
                       <a:avLst/>
@@ -2504,7 +3563,7 @@
           <w:sz w:val="18"/>
           <w:szCs w:val="18"/>
         </w:rPr>
-        <w:t xml:space="preserve">Figure 2. Learned transition matrix. Each row sums to 1. Self-transitions are between 0.97 and 0.98.</w:t>
+        <w:t xml:space="preserve">Figure 2. Emission model B: mean and standard deviation of each state's Gaussian on every scaled feature.</w:t>
       </w:r>
     </w:p>
     <w:p>
@@ -2517,7 +3576,7 @@
           <w:sz w:val="22"/>
           <w:szCs w:val="22"/>
         </w:rPr>
-        <w:t xml:space="preserve">A half-second hop should be almost diagonal, and it is. A person does not change activity on most steps. The off-diagonal mass that survives is small and local. Standing keeps about 0.01 toward still and 0.01 toward jumping. Walking keeps 0.014 toward jumping. Jumping keeps 0.019 toward walking. Still keeps 0.016 toward standing. Walking into still, and jumping into still, sit on the numerical floor and print as 0.00. Those changes are a single boundary frame against a long run, and EM treats them as noise.</w:t>
+        <w:t xml:space="preserve">On every size feature in Figure 2 the four means are ordered still, standing, walking, jumping, about 0.9 pooled standard deviations apart, while each state's own spread is at most 0.14. That gap is what makes the decoding exact. The frequency features carry less: their spreads are wide, and the acceleration peak fires in only 27% of walking windows, because a one-second window holds about two strides.</w:t>
       </w:r>
     </w:p>
     <w:p>
@@ -2529,9 +3588,9 @@
       <w:r>
         <w:drawing>
           <wp:inline distT="0" distB="0" distL="0" distR="0">
-            <wp:extent cx="5334000" cy="2343150"/>
+            <wp:extent cx="3108960" cy="2607514"/>
             <wp:effectExtent t="0" r="0" b="0" l="0"/>
-            <wp:docPr id="3" name="Recorded activity and Viterbi path on one held-out mixed recording" descr="Recorded activity and Viterbi path on one held-out mixed recording" title="Recorded activity and Viterbi path on one held-out mixed recording"/>
+            <wp:docPr id="3" name="Learned transition matrix" descr="Learned transition matrix" title="Learned transition matrix"/>
             <wp:cNvGraphicFramePr>
               <a:graphicFrameLocks xmlns:a="http://schemas.openxmlformats.org/drawingml/2006/main" noChangeAspect="1"/>
             </wp:cNvGraphicFramePr>
@@ -2545,7 +3604,7 @@
                     </pic:cNvPicPr>
                   </pic:nvPicPr>
                   <pic:blipFill>
-                    <a:blip r:embed="rId11" cstate="none"/>
+                    <a:blip r:embed="rId32" cstate="none"/>
                     <a:srcRect/>
                     <a:stretch>
                       <a:fillRect/>
@@ -2554,7 +3613,7 @@
                   <pic:spPr bwMode="auto">
                     <a:xfrm>
                       <a:off x="0" y="0"/>
-                      <a:ext cx="5334000" cy="2343150"/>
+                      <a:ext cx="3108960" cy="2607514"/>
                     </a:xfrm>
                     <a:prstGeom prst="rect">
                       <a:avLst/>
@@ -2566,37 +3625,12 @@
           </wp:inline>
         </w:drawing>
       </w:r>
-    </w:p>
-    <w:p>
-      <w:pPr>
-        <w:keepLines/>
-        <w:spacing w:after="120" w:before="20"/>
-        <w:jc w:val="center"/>
-      </w:pPr>
-      <w:r>
-        <w:rPr>
-          <w:rFonts w:ascii="Arial" w:cs="Arial" w:eastAsia="Arial" w:hAnsi="Arial"/>
-          <w:i/>
-          <w:iCs/>
-          <w:color w:val="444444"/>
-          <w:sz w:val="18"/>
-          <w:szCs w:val="18"/>
-        </w:rPr>
-        <w:t xml:space="preserve">Figure 3. Viterbi on the held-out file sequence_006.csv. The path follows walking, jumping, walking, then standing, and inserts a short still during the final standing segment.</w:t>
-      </w:r>
-    </w:p>
-    <w:p>
-      <w:pPr>
-        <w:keepNext/>
-        <w:spacing w:after="20" w:before="80"/>
-        <w:jc w:val="center"/>
-      </w:pPr>
       <w:r>
         <w:drawing>
           <wp:inline distT="0" distB="0" distL="0" distR="0">
-            <wp:extent cx="3810000" cy="3190875"/>
+            <wp:extent cx="3108960" cy="2607514"/>
             <wp:effectExtent t="0" r="0" b="0" l="0"/>
-            <wp:docPr id="4" name="Confusion matrix for held-out single-activity files" descr="Confusion matrix for held-out single-activity files" title="Confusion matrix for held-out single-activity files"/>
+            <wp:docPr id="4" name="Confusion matrix on the unseen windows" descr="Confusion matrix on the unseen windows" title="Confusion matrix on the unseen windows"/>
             <wp:cNvGraphicFramePr>
               <a:graphicFrameLocks xmlns:a="http://schemas.openxmlformats.org/drawingml/2006/main" noChangeAspect="1"/>
             </wp:cNvGraphicFramePr>
@@ -2610,7 +3644,7 @@
                     </pic:cNvPicPr>
                   </pic:nvPicPr>
                   <pic:blipFill>
-                    <a:blip r:embed="rId12" cstate="none"/>
+                    <a:blip r:embed="rId33" cstate="none"/>
                     <a:srcRect/>
                     <a:stretch>
                       <a:fillRect/>
@@ -2619,7 +3653,7 @@
                   <pic:spPr bwMode="auto">
                     <a:xfrm>
                       <a:off x="0" y="0"/>
-                      <a:ext cx="3810000" cy="3190875"/>
+                      <a:ext cx="3108960" cy="2607514"/>
                     </a:xfrm>
                     <a:prstGeom prst="rect">
                       <a:avLst/>
@@ -2647,7 +3681,7 @@
           <w:sz w:val="18"/>
           <w:szCs w:val="18"/>
         </w:rPr>
-        <w:t xml:space="preserve">Figure 4. Confusion matrix on the 40 held-out single-activity files. Both errors are standing windows decoded as still.</w:t>
+        <w:t xml:space="preserve">Figure 3. Left: learned transition matrix A; each row sums to 1. Right: confusion matrix on the 581 unseen windows.</w:t>
       </w:r>
     </w:p>
     <w:p>
@@ -2660,7 +3694,85 @@
           <w:sz w:val="22"/>
           <w:szCs w:val="22"/>
         </w:rPr>
-        <w:t xml:space="preserve">On the training windows, before z-scoring, the frequency features split the classes in a way the time-domain size features do not finish. Walking has an acceleration peak at 1.85 Hz on average, and every walking window cleared the noise floor. Jumping cleared it on none. An impact is broadband, so the dominant frequency is reported as 0 Hz rather than as a fake cadence. Spectral energy carries that distinction. Its training mean is about 562 for jumping, 41 for walking, 0.08 for standing, and 0.005 for still. The gyroscope peak tells the same walking story, at 1.83 Hz, and is absent for jumps. Standing versus still is the pair left over. Both have little energy, and about 28 percent of standing windows have no accepted peak.</w:t>
+        <w:t xml:space="preserve">The transition matrix is close to the identity. Self-transitions are 0.998 for standing, 0.997 for still, and 1.000 for walking and jumping. With a half-second hop, a self-transition a means an expected stay of 0.5 / (1 − a) seconds: about 5 minutes standing and 2.5 minutes still, which is a plausible length for those states, but an endless walk or jump is not. The cause is the protocol. Every file holds one activity, so every pair of consecutive training windows is a self-transition. The small standing-to-still and still-to-standing mass (0.002 and 0.003) is what EM assigns when a quiet standing window looks partly like still.</w:t>
+      </w:r>
+    </w:p>
+    <w:p>
+      <w:pPr>
+        <w:keepNext/>
+        <w:spacing w:after="20" w:before="80"/>
+        <w:jc w:val="center"/>
+      </w:pPr>
+      <w:r>
+        <w:drawing>
+          <wp:inline distT="0" distB="0" distL="0" distR="0">
+            <wp:extent cx="5486400" cy="2408663"/>
+            <wp:effectExtent t="0" r="0" b="0" l="0"/>
+            <wp:docPr id="5" name="Viterbi path on seven unseen files joined end to end" descr="Viterbi path on seven unseen files joined end to end" title="Viterbi path on seven unseen files joined end to end"/>
+            <wp:cNvGraphicFramePr>
+              <a:graphicFrameLocks xmlns:a="http://schemas.openxmlformats.org/drawingml/2006/main" noChangeAspect="1"/>
+            </wp:cNvGraphicFramePr>
+            <a:graphic xmlns:a="http://schemas.openxmlformats.org/drawingml/2006/main">
+              <a:graphicData uri="http://schemas.openxmlformats.org/drawingml/2006/picture">
+                <pic:pic xmlns:pic="http://schemas.openxmlformats.org/drawingml/2006/picture">
+                  <pic:nvPicPr>
+                    <pic:cNvPr id="0" name="" descr=""/>
+                    <pic:cNvPicPr>
+                      <a:picLocks noChangeAspect="1" noChangeArrowheads="1"/>
+                    </pic:cNvPicPr>
+                  </pic:nvPicPr>
+                  <pic:blipFill>
+                    <a:blip r:embed="rId34" cstate="none"/>
+                    <a:srcRect/>
+                    <a:stretch>
+                      <a:fillRect/>
+                    </a:stretch>
+                  </pic:blipFill>
+                  <pic:spPr bwMode="auto">
+                    <a:xfrm>
+                      <a:off x="0" y="0"/>
+                      <a:ext cx="5486400" cy="2408663"/>
+                    </a:xfrm>
+                    <a:prstGeom prst="rect">
+                      <a:avLst/>
+                    </a:prstGeom>
+                  </pic:spPr>
+                </pic:pic>
+              </a:graphicData>
+            </a:graphic>
+          </wp:inline>
+        </w:drawing>
+      </w:r>
+    </w:p>
+    <w:p>
+      <w:pPr>
+        <w:keepLines/>
+        <w:spacing w:after="120" w:before="20"/>
+        <w:jc w:val="center"/>
+      </w:pPr>
+      <w:r>
+        <w:rPr>
+          <w:rFonts w:ascii="Arial" w:cs="Arial" w:eastAsia="Arial" w:hAnsi="Arial"/>
+          <w:i/>
+          <w:iCs/>
+          <w:color w:val="444444"/>
+          <w:sz w:val="18"/>
+          <w:szCs w:val="18"/>
+        </w:rPr>
+        <w:t xml:space="preserve">Figure 4. Viterbi on seven unseen files joined end to end: still, standing, walking, jumping, walking, standing, still. The changes are file boundaries, not recorded transitions.</w:t>
+      </w:r>
+    </w:p>
+    <w:p>
+      <w:pPr>
+        <w:spacing w:after="120" w:before="0" w:line="252"/>
+      </w:pPr>
+      <w:r>
+        <w:rPr>
+          <w:rFonts w:ascii="Arial" w:cs="Arial" w:eastAsia="Arial" w:hAnsi="Arial"/>
+          <w:sz w:val="22"/>
+          <w:szCs w:val="22"/>
+        </w:rPr>
+        <w:t xml:space="preserve">No recording yet changes activity mid-file, so Figure 4 joins seven unseen files into one 58-second sequence. Viterbi follows every change, in both directions, without a wrong window. It switches even though A gives each change a probability near 10⁻⁸, because the emissions of neighbouring states differ by far more than that penalty.</w:t>
       </w:r>
     </w:p>
     <w:p>
@@ -2694,7 +3806,7 @@
           <w:sz w:val="22"/>
           <w:szCs w:val="22"/>
         </w:rPr>
-        <w:t xml:space="preserve">Walking and jumping separate from rest, and from each other, once magnitude, spectral energy, and a gyroscope peak are in the observation. That is why their sensitivity on new single-activity files is 1.000. Standing and still are the hard pair, and the errors fall on one side only. A quiet sway is called still, and a still file is not called standing. For the break coach that bias over-counts sedentary time. On these files the amount is 2 windows out of 143.</w:t>
+        <w:t xml:space="preserve">Jumping was the easiest state: its spectral energy is about 700 times walking's, and its gyroscope peak fires in 86% of its windows. Walking came next. Standing and still were the hard pair. The phone was flat and screen-up in both, so orientation does not separate them; only the size of the motion does, about 0.1 m/s² of sway against 0.01 m/s² of sensor noise. On a plain z-score that difference is smaller than the variance floor, and Baum-Welch merged the two states: standing sensitivity fell to 0.587, and the model learned a standing-to-still probability of 0.52 that no recording supports. The log transform is what keeps them apart.</w:t>
       </w:r>
     </w:p>
     <w:p>
@@ -2707,7 +3819,7 @@
           <w:sz w:val="22"/>
           <w:szCs w:val="22"/>
         </w:rPr>
-        <w:t xml:space="preserve">The transition matrix agrees with the coarse pattern of the sessions and drops some of the detail. Self-transitions dominate, and the standing–still link is one of the few off-diagonal pairs with any mass, which matches the only confusion in the emissions. A Dirichlet count added back at every M-step, or simply more mixed sessions, would keep a rare change such as walking into still from disappearing. The still spike in Figure 3 is the same limit on one path. At the start of standing, one window is closer to the still Gaussian, and the transition cost of a brief detour is low.</w:t>
+        <w:t xml:space="preserve">On unseen files from the same session, the model generalises without a single error. That result is narrower than it looks. Training and test files share one person, one phone, one way of holding it, and one hour, so the test asks whether later repetitions look like earlier ones. It does not show how the model handles a pocket, another surface, or another person's gait.</w:t>
       </w:r>
     </w:p>
     <w:p>
@@ -2720,7 +3832,7 @@
           <w:sz w:val="22"/>
           <w:szCs w:val="22"/>
         </w:rPr>
-        <w:t xml:space="preserve">The mixture of 40, 50, and 100 Hz recordings is not what limits the model. After interpolation every window shares a 50 Hz grid. What the simulation leaves out is what a pocket actually does. The rate can drift, a timestamp can gap, and the phone can rotate inside the second that is treated as one gravity vector. Gravity removal is wrong for a window that contains both a turn and a step. Labels at a change of activity are already the majority of a one-second block, so they are late by up to half a second.</w:t>
+        <w:t xml:space="preserve">Sensor noise sets the still state at about 0.01 m/s², ten times below standing sway, so noise caused no errors here. The 100 Hz stream was clean. Downsampling to 50 Hz did not limit the model, but it is done without a low-pass filter, so the sharp landings can fold energy from above 25 Hz into the band below; a filter before resampling would remove that. The window length matters more than the rate. One second is too short for a reliable cadence peak, and a two-second window roughly doubles the share of walking windows with a peak, from 27% to 55%, at the cost of a slower response to a change.</w:t>
       </w:r>
     </w:p>
     <w:p>
@@ -2733,7 +3845,7 @@
           <w:sz w:val="22"/>
           <w:szCs w:val="22"/>
         </w:rPr>
-        <w:t xml:space="preserve">The four collection videos are not in this repository. The pipeline is ready for real exports that use the same header, and for one face-visible video per activity. Once those exist, the changes that would matter are more than one person, a magnetometer, and a second Gaussian on the jumping state so the flight and the landing do not have to share one variance. Resampling, the training-only z-score, Baum-Welch, and Viterbi stay as they are.</w:t>
+        <w:t xml:space="preserve">The most useful next data are recordings that change activity, such as still to standing to walking, labelled at each change, so that A learns real behaviour instead of the protocol. After that come a second participant and a second phone, which would also exercise the resampling; recordings with the phone in a pocket; the gravity direction from the uncalibrated accelerometer as an extra feature, so posture can count; and a Dirichlet prior kept in every M-step, so a rare change cannot fall to the 10⁻⁸ floor. Resampling, the log and z-score scaling, Baum-Welch, and Viterbi can stay as they are.</w:t>
       </w:r>
     </w:p>
     <w:sectPr>

</xml_diff>

<commit_message>
Link the report's video placeholders to the committed clips.
</commit_message>
<xml_diff>
--- a/report/Formative_2_Hidden_Markov_Models.docx
+++ b/report/Formative_2_Hidden_Markov_Models.docx
@@ -1076,15 +1076,18 @@
         </w:rPr>
         <w:t xml:space="preserve">Collection videos, one per activity, with full body and face visible: Standing </w:t>
       </w:r>
-      <w:r>
-        <w:rPr>
-          <w:rFonts w:ascii="Arial" w:cs="Arial" w:eastAsia="Arial" w:hAnsi="Arial"/>
-          <w:sz w:val="22"/>
-          <w:szCs w:val="22"/>
-          <w:highlight w:val="yellow"/>
-        </w:rPr>
-        <w:t xml:space="preserve">PASTE_LINK</w:t>
-      </w:r>
+      <w:hyperlink r:id="rId40" w:history="1">
+        <w:r>
+          <w:rPr>
+            <w:rFonts w:ascii="Arial" w:cs="Arial" w:eastAsia="Arial" w:hAnsi="Arial"/>
+            <w:color w:val="0563C1"/>
+            <w:sz w:val="22"/>
+            <w:szCs w:val="22"/>
+            <w:u w:val="single"/>
+          </w:rPr>
+          <w:t xml:space="preserve">https://github.com/supserrr/hidden-markov-models/blob/main/videos/standing.mp4</w:t>
+        </w:r>
+      </w:hyperlink>
       <w:r>
         <w:rPr>
           <w:rFonts w:ascii="Arial" w:cs="Arial" w:eastAsia="Arial" w:hAnsi="Arial"/>
@@ -1093,15 +1096,18 @@
         </w:rPr>
         <w:t xml:space="preserve">, Walking </w:t>
       </w:r>
-      <w:r>
-        <w:rPr>
-          <w:rFonts w:ascii="Arial" w:cs="Arial" w:eastAsia="Arial" w:hAnsi="Arial"/>
-          <w:sz w:val="22"/>
-          <w:szCs w:val="22"/>
-          <w:highlight w:val="yellow"/>
-        </w:rPr>
-        <w:t xml:space="preserve">PASTE_LINK</w:t>
-      </w:r>
+      <w:hyperlink r:id="rId41" w:history="1">
+        <w:r>
+          <w:rPr>
+            <w:rFonts w:ascii="Arial" w:cs="Arial" w:eastAsia="Arial" w:hAnsi="Arial"/>
+            <w:color w:val="0563C1"/>
+            <w:sz w:val="22"/>
+            <w:szCs w:val="22"/>
+            <w:u w:val="single"/>
+          </w:rPr>
+          <w:t xml:space="preserve">https://github.com/supserrr/hidden-markov-models/blob/main/videos/walking.mp4</w:t>
+        </w:r>
+      </w:hyperlink>
       <w:r>
         <w:rPr>
           <w:rFonts w:ascii="Arial" w:cs="Arial" w:eastAsia="Arial" w:hAnsi="Arial"/>
@@ -1110,15 +1116,18 @@
         </w:rPr>
         <w:t xml:space="preserve">, Jumping </w:t>
       </w:r>
-      <w:r>
-        <w:rPr>
-          <w:rFonts w:ascii="Arial" w:cs="Arial" w:eastAsia="Arial" w:hAnsi="Arial"/>
-          <w:sz w:val="22"/>
-          <w:szCs w:val="22"/>
-          <w:highlight w:val="yellow"/>
-        </w:rPr>
-        <w:t xml:space="preserve">PASTE_LINK</w:t>
-      </w:r>
+      <w:hyperlink r:id="rId42" w:history="1">
+        <w:r>
+          <w:rPr>
+            <w:rFonts w:ascii="Arial" w:cs="Arial" w:eastAsia="Arial" w:hAnsi="Arial"/>
+            <w:color w:val="0563C1"/>
+            <w:sz w:val="22"/>
+            <w:szCs w:val="22"/>
+            <w:u w:val="single"/>
+          </w:rPr>
+          <w:t xml:space="preserve">https://github.com/supserrr/hidden-markov-models/blob/main/videos/jumping.mp4</w:t>
+        </w:r>
+      </w:hyperlink>
       <w:r>
         <w:rPr>
           <w:rFonts w:ascii="Arial" w:cs="Arial" w:eastAsia="Arial" w:hAnsi="Arial"/>
@@ -1127,15 +1136,18 @@
         </w:rPr>
         <w:t xml:space="preserve">, Still </w:t>
       </w:r>
-      <w:r>
-        <w:rPr>
-          <w:rFonts w:ascii="Arial" w:cs="Arial" w:eastAsia="Arial" w:hAnsi="Arial"/>
-          <w:sz w:val="22"/>
-          <w:szCs w:val="22"/>
-          <w:highlight w:val="yellow"/>
-        </w:rPr>
-        <w:t xml:space="preserve">PASTE_LINK</w:t>
-      </w:r>
+      <w:hyperlink r:id="rId43" w:history="1">
+        <w:r>
+          <w:rPr>
+            <w:rFonts w:ascii="Arial" w:cs="Arial" w:eastAsia="Arial" w:hAnsi="Arial"/>
+            <w:color w:val="0563C1"/>
+            <w:sz w:val="22"/>
+            <w:szCs w:val="22"/>
+            <w:u w:val="single"/>
+          </w:rPr>
+          <w:t xml:space="preserve">https://github.com/supserrr/hidden-markov-models/blob/main/videos/still.mp4</w:t>
+        </w:r>
+      </w:hyperlink>
       <w:r>
         <w:rPr>
           <w:rFonts w:ascii="Arial" w:cs="Arial" w:eastAsia="Arial" w:hAnsi="Arial"/>

</xml_diff>